<commit_message>
Record the 11-sep pre-demo battery and Gonzalo meeting-prep verdicts.
Q5 resolved as OTIS LCB II, not KONE; the 12-question runner is pinned so the scripted demo terrain stays auditable.
</commit_message>
<xml_diff>
--- a/docs/PREP_REUNION_GONZALO_2026-09-11.docx
+++ b/docs/PREP_REUNION_GONZALO_2026-09-11.docx
@@ -7,52 +7,10 @@
         <w:pStyle w:val="Title"/>
       </w:pPr>
       <w:r>
-        <w:t xml:space="preserve">Preparación — Reunión con Gonzalo Salazar</w:t>
-      </w:r>
-    </w:p>
-    <w:p>
-      <w:pPr>
-        <w:pStyle w:val="Subtitle"/>
-      </w:pPr>
-      <w:r>
-        <w:t xml:space="preserve">Viernes 11 de septiembre de 2026 · 09:30 · Manuel Montt, Providencia</w:t>
-      </w:r>
-    </w:p>
-    <w:p>
-      <w:pPr>
-        <w:pStyle w:val="Author"/>
-      </w:pPr>
-      <w:r>
-        <w:t xml:space="preserve">Danebo · documento operativo de preparación</w:t>
-      </w:r>
-    </w:p>
-    <w:sdt>
-      <w:sdtPr>
-        <w:docPartObj>
-          <w:docPartGallery w:val="Table of Contents"/>
-          <w:docPartUnique/>
-        </w:docPartObj>
-      </w:sdtPr>
-      <w:sdtContent>
-        <w:p>
-          <w:pPr>
-            <w:pStyle w:val="TOCHeading"/>
-          </w:pPr>
-          <w:r>
-            <w:t xml:space="preserve">Table of Contents</w:t>
-          </w:r>
-        </w:p>
-        <w:p>
-          <w:r>
-            <w:fldChar w:fldCharType="begin" w:dirty="true"/>
-            <w:instrText xml:space="preserve">TOC \o "1-2" \h \z \u</w:instrText>
-            <w:fldChar w:fldCharType="separate"/>
-            <w:fldChar w:fldCharType="end"/>
-          </w:r>
-        </w:p>
-      </w:sdtContent>
-    </w:sdt>
-    <w:bookmarkStart w:id="55" w:name="Xc9624d36d7e5db14d30affcb1a4804e6d0f6d78"/>
+        <w:t xml:space="preserve">Preparación — Reunión con Gonzalo Salazar · viernes 11 de septiembre de 2026</w:t>
+      </w:r>
+    </w:p>
+    <w:bookmarkStart w:id="56" w:name="Xc9624d36d7e5db14d30affcb1a4804e6d0f6d78"/>
     <w:p>
       <w:pPr>
         <w:pStyle w:val="Heading1"/>
@@ -946,7 +904,7 @@
       </w:r>
     </w:p>
     <w:bookmarkEnd w:id="12"/>
-    <w:bookmarkStart w:id="18" w:name="preparación-de-hoy-jueves"/>
+    <w:bookmarkStart w:id="19" w:name="preparación-de-hoy-jueves"/>
     <w:p>
       <w:pPr>
         <w:pStyle w:val="Heading2"/>
@@ -1003,23 +961,131 @@
         <w:rPr>
           <w:b/>
           <w:bCs/>
+          <w:strike/>
         </w:rPr>
         <w:t xml:space="preserve">Ejecutar las 12 preguntas de prueba de la sección 4</w:t>
       </w:r>
       <w:r>
-        <w:t xml:space="preserve"> </w:t>
-      </w:r>
-      <w:r>
+        <w:rPr>
+          <w:strike/>
+        </w:rPr>
+        <w:t xml:space="preserve"> </w:t>
+      </w:r>
+      <w:r>
+        <w:rPr>
+          <w:strike/>
+        </w:rPr>
         <w:t xml:space="preserve">contra la cuenta piloto (</w:t>
       </w:r>
       <w:r>
         <w:rPr>
           <w:rStyle w:val="VerbatimChar"/>
+          <w:strike/>
         </w:rPr>
         <w:t xml:space="preserve">piloto.danebo.ai</w:t>
       </w:r>
       <w:r>
+        <w:rPr>
+          <w:strike/>
+        </w:rPr>
         <w:t xml:space="preserve">, corpus de Gonzalo). Anotar cuáles fallan.</w:t>
+      </w:r>
+      <w:r>
+        <w:t xml:space="preserve"> </w:t>
+      </w:r>
+      <w:r>
+        <w:rPr>
+          <w:b/>
+          <w:bCs/>
+        </w:rPr>
+        <w:t xml:space="preserve">Hecho, 11-sep 00:32.</w:t>
+      </w:r>
+      <w:r>
+        <w:t xml:space="preserve"> </w:t>
+      </w:r>
+      <w:r>
+        <w:t xml:space="preserve">Veredictos (detalle en</w:t>
+      </w:r>
+      <w:r>
+        <w:t xml:space="preserve"> </w:t>
+      </w:r>
+      <w:hyperlink r:id="rId13">
+        <w:r>
+          <w:rPr>
+            <w:rStyle w:val="VerbatimChar"/>
+          </w:rPr>
+          <w:t xml:space="preserve">EJECUCION_PRE_DEMO_2026-09-10.md</w:t>
+        </w:r>
+      </w:hyperlink>
+      <w:r>
+        <w:t xml:space="preserve"> </w:t>
+      </w:r>
+      <w:r>
+        <w:t xml:space="preserve">§Fase 5):</w:t>
+      </w:r>
+      <w:r>
+        <w:t xml:space="preserve"> </w:t>
+      </w:r>
+      <w:r>
+        <w:rPr>
+          <w:b/>
+          <w:bCs/>
+        </w:rPr>
+        <w:t xml:space="preserve">fuerte</w:t>
+      </w:r>
+      <w:r>
+        <w:t xml:space="preserve"> </w:t>
+      </w:r>
+      <w:r>
+        <w:t xml:space="preserve">#5 (LCB II — es OTIS, no KONE), #8 (Fuji Yida), #9 (foto consola OTIS), #12 (Schindler rechaza, con fuga de inventario);</w:t>
+      </w:r>
+      <w:r>
+        <w:t xml:space="preserve"> </w:t>
+      </w:r>
+      <w:r>
+        <w:rPr>
+          <w:b/>
+          <w:bCs/>
+        </w:rPr>
+        <w:t xml:space="preserve">correcta pero vacía</w:t>
+      </w:r>
+      <w:r>
+        <w:t xml:space="preserve"> </w:t>
+      </w:r>
+      <w:r>
+        <w:t xml:space="preserve">#1, #2, #11;</w:t>
+      </w:r>
+      <w:r>
+        <w:t xml:space="preserve"> </w:t>
+      </w:r>
+      <w:r>
+        <w:rPr>
+          <w:b/>
+          <w:bCs/>
+        </w:rPr>
+        <w:t xml:space="preserve">débil</w:t>
+      </w:r>
+      <w:r>
+        <w:t xml:space="preserve"> </w:t>
+      </w:r>
+      <w:r>
+        <w:t xml:space="preserve">#3, #4, #10;</w:t>
+      </w:r>
+      <w:r>
+        <w:t xml:space="preserve"> </w:t>
+      </w:r>
+      <w:r>
+        <w:rPr>
+          <w:b/>
+          <w:bCs/>
+        </w:rPr>
+        <w:t xml:space="preserve">defecto</w:t>
+      </w:r>
+      <w:r>
+        <w:t xml:space="preserve"> </w:t>
+      </w:r>
+      <w:r>
+        <w:t xml:space="preserve">#7 (mezcla con MediaCoder); #6 descartada desde Fase 1 (sin evidencia en el corpus).</w:t>
       </w:r>
     </w:p>
     <w:p>
@@ -1104,7 +1170,7 @@
         <w:t xml:space="preserve">(sección 14).</w:t>
       </w:r>
     </w:p>
-    <w:bookmarkStart w:id="13" w:name="corpus-disponible-en-la-cuenta-piloto"/>
+    <w:bookmarkStart w:id="14" w:name="corpus-disponible-en-la-cuenta-piloto"/>
     <w:p>
       <w:pPr>
         <w:pStyle w:val="Heading3"/>
@@ -1436,8 +1502,8 @@
         </w:tc>
       </w:tr>
     </w:tbl>
-    <w:bookmarkEnd w:id="13"/>
-    <w:bookmarkStart w:id="14" w:name="X2e46a721daa5bd45bb84e88982639a69426f8d3"/>
+    <w:bookmarkEnd w:id="14"/>
+    <w:bookmarkStart w:id="15" w:name="X2e46a721daa5bd45bb84e88982639a69426f8d3"/>
     <w:p>
       <w:pPr>
         <w:pStyle w:val="Heading3"/>
@@ -1492,8 +1558,8 @@
         <w:t xml:space="preserve">, y está verificado que son recuperables en la cuenta del piloto.</w:t>
       </w:r>
     </w:p>
-    <w:bookmarkEnd w:id="14"/>
-    <w:bookmarkStart w:id="16" w:name="X32f2e5af430273485a2585a21b611d16bc81787"/>
+    <w:bookmarkEnd w:id="15"/>
+    <w:bookmarkStart w:id="17" w:name="X32f2e5af430273485a2585a21b611d16bc81787"/>
     <w:p>
       <w:pPr>
         <w:pStyle w:val="Heading3"/>
@@ -1660,7 +1726,7 @@
       <w:r>
         <w:t xml:space="preserve"> </w:t>
       </w:r>
-      <w:hyperlink r:id="rId15">
+      <w:hyperlink r:id="rId16">
         <w:r>
           <w:rPr>
             <w:rStyle w:val="VerbatimChar"/>
@@ -1787,8 +1853,8 @@
         <w:t xml:space="preserve">repuestos, excluido por decisión de producto, no por falla técnica.</w:t>
       </w:r>
     </w:p>
-    <w:bookmarkEnd w:id="16"/>
-    <w:bookmarkStart w:id="17" w:name="X8c75bf84aa1c9754547e4108577c6d7d7d1e1df"/>
+    <w:bookmarkEnd w:id="17"/>
+    <w:bookmarkStart w:id="18" w:name="X8c75bf84aa1c9754547e4108577c6d7d7d1e1df"/>
     <w:p>
       <w:pPr>
         <w:pStyle w:val="Heading3"/>
@@ -1835,9 +1901,9 @@
         </w:pict>
       </w:r>
     </w:p>
-    <w:bookmarkEnd w:id="17"/>
     <w:bookmarkEnd w:id="18"/>
-    <w:bookmarkStart w:id="19" w:name="las-12-preguntas-para-probar-la-app-hoy"/>
+    <w:bookmarkEnd w:id="19"/>
+    <w:bookmarkStart w:id="20" w:name="las-12-preguntas-para-probar-la-app-hoy"/>
     <w:p>
       <w:pPr>
         <w:pStyle w:val="Heading2"/>
@@ -2076,8 +2142,8 @@
         </w:pict>
       </w:r>
     </w:p>
-    <w:bookmarkEnd w:id="19"/>
-    <w:bookmarkStart w:id="26" w:name="guion-minuto-a-minuto"/>
+    <w:bookmarkEnd w:id="20"/>
+    <w:bookmarkStart w:id="27" w:name="guion-minuto-a-minuto"/>
     <w:p>
       <w:pPr>
         <w:pStyle w:val="Heading2"/>
@@ -2086,7 +2152,7 @@
         <w:t xml:space="preserve">5. Guion minuto a minuto</w:t>
       </w:r>
     </w:p>
-    <w:bookmarkStart w:id="20" w:name="apertura-con-su-propia-idea"/>
+    <w:bookmarkStart w:id="21" w:name="apertura-con-su-propia-idea"/>
     <w:p>
       <w:pPr>
         <w:pStyle w:val="Heading3"/>
@@ -2180,8 +2246,8 @@
         <w:t xml:space="preserve">(la consulta al manual, que objetó dos veces), y abre natural la conversación de licencia del corpus.</w:t>
       </w:r>
     </w:p>
-    <w:bookmarkEnd w:id="20"/>
-    <w:bookmarkStart w:id="21" w:name="revisión-en-el-teléfono"/>
+    <w:bookmarkEnd w:id="21"/>
+    <w:bookmarkStart w:id="22" w:name="revisión-en-el-teléfono"/>
     <w:p>
       <w:pPr>
         <w:pStyle w:val="Heading3"/>
@@ -2317,7 +2383,46 @@
               <w:pStyle w:val="Compact"/>
             </w:pPr>
             <w:r>
-              <w:t xml:space="preserve">Una foto suya de consola, tarjeta o plano.</w:t>
+              <w:t xml:space="preserve">Sugiere</w:t>
+            </w:r>
+            <w:r>
+              <w:t xml:space="preserve"> </w:t>
+            </w:r>
+            <w:r>
+              <w:rPr>
+                <w:b/>
+                <w:bCs/>
+              </w:rPr>
+              <w:t xml:space="preserve">consola o tarjeta tipo URM</w:t>
+            </w:r>
+            <w:r>
+              <w:t xml:space="preserve"> </w:t>
+            </w:r>
+            <w:r>
+              <w:t xml:space="preserve">(verificado fuerte, Fase 5 #9).</w:t>
+            </w:r>
+            <w:r>
+              <w:t xml:space="preserve"> </w:t>
+            </w:r>
+            <w:r>
+              <w:rPr>
+                <w:b/>
+                <w:bCs/>
+              </w:rPr>
+              <w:t xml:space="preserve">Plano solo si él insiste</w:t>
+            </w:r>
+            <w:r>
+              <w:t xml:space="preserve">, y antes de mostrarlo dile la frase de límite:</w:t>
+            </w:r>
+            <w:r>
+              <w:t xml:space="preserve"> </w:t>
+            </w:r>
+            <w:r>
+              <w:rPr>
+                <w:i/>
+                <w:iCs/>
+              </w:rPr>
+              <w:t xml:space="preserve">“esto no reemplaza el tester; el código puede decir puertas y ser el variador.”</w:t>
             </w:r>
             <w:r>
               <w:t xml:space="preserve"> </w:t>
@@ -2458,8 +2563,237 @@
         <w:t xml:space="preserve">Que escuche que tú sabes eso vale más que cualquier respuesta del sistema.</w:t>
       </w:r>
     </w:p>
-    <w:bookmarkEnd w:id="21"/>
-    <w:bookmarkStart w:id="22" w:name="el-circuito-de-voz-del-certificador"/>
+    <w:p>
+      <w:pPr>
+        <w:pStyle w:val="BlockText"/>
+      </w:pPr>
+      <w:r>
+        <w:rPr>
+          <w:b/>
+          <w:bCs/>
+        </w:rPr>
+        <w:t xml:space="preserve">Nota terreno fuerte / flaco por marca</w:t>
+      </w:r>
+      <w:r>
+        <w:t xml:space="preserve"> </w:t>
+      </w:r>
+      <w:r>
+        <w:t xml:space="preserve">(leer solo si él pide sugerencia de marca, no de memoria — verificado en Fase 5,</w:t>
+      </w:r>
+      <w:r>
+        <w:t xml:space="preserve"> </w:t>
+      </w:r>
+      <w:hyperlink r:id="rId13">
+        <w:r>
+          <w:rPr>
+            <w:rStyle w:val="VerbatimChar"/>
+          </w:rPr>
+          <w:t xml:space="preserve">EJECUCION_PRE_DEMO_2026-09-10.md</w:t>
+        </w:r>
+      </w:hyperlink>
+      <w:r>
+        <w:t xml:space="preserve">):</w:t>
+      </w:r>
+    </w:p>
+    <w:p>
+      <w:pPr>
+        <w:pStyle w:val="Compact"/>
+        <w:numPr>
+          <w:ilvl w:val="0"/>
+          <w:numId w:val="1002"/>
+        </w:numPr>
+      </w:pPr>
+      <w:r>
+        <w:rPr>
+          <w:b/>
+          <w:bCs/>
+        </w:rPr>
+        <w:t xml:space="preserve">Fuerte:</w:t>
+      </w:r>
+      <w:r>
+        <w:t xml:space="preserve"> </w:t>
+      </w:r>
+      <w:r>
+        <w:rPr>
+          <w:b/>
+          <w:bCs/>
+        </w:rPr>
+        <w:t xml:space="preserve">Fuji Yida</w:t>
+      </w:r>
+      <w:r>
+        <w:t xml:space="preserve"> </w:t>
+      </w:r>
+      <w:r>
+        <w:t xml:space="preserve">(parametrización completa y citada, #8);</w:t>
+      </w:r>
+      <w:r>
+        <w:t xml:space="preserve"> </w:t>
+      </w:r>
+      <w:r>
+        <w:rPr>
+          <w:b/>
+          <w:bCs/>
+        </w:rPr>
+        <w:t xml:space="preserve">LCB II</w:t>
+      </w:r>
+      <w:r>
+        <w:t xml:space="preserve"> </w:t>
+      </w:r>
+      <w:r>
+        <w:t xml:space="preserve">(aclarando que es placa</w:t>
+      </w:r>
+      <w:r>
+        <w:t xml:space="preserve"> </w:t>
+      </w:r>
+      <w:r>
+        <w:rPr>
+          <w:b/>
+          <w:bCs/>
+        </w:rPr>
+        <w:t xml:space="preserve">OTIS</w:t>
+      </w:r>
+      <w:r>
+        <w:t xml:space="preserve">, no KONE, si sale el tema, #5); rechazo de</w:t>
+      </w:r>
+      <w:r>
+        <w:t xml:space="preserve"> </w:t>
+      </w:r>
+      <w:r>
+        <w:rPr>
+          <w:b/>
+          <w:bCs/>
+        </w:rPr>
+        <w:t xml:space="preserve">Schindler</w:t>
+      </w:r>
+      <w:r>
+        <w:t xml:space="preserve"> </w:t>
+      </w:r>
+      <w:r>
+        <w:t xml:space="preserve">(no inventa, aunque nombra</w:t>
+      </w:r>
+      <w:r>
+        <w:t xml:space="preserve"> </w:t>
+      </w:r>
+      <w:r>
+        <w:t xml:space="preserve">“Thyssen”</w:t>
+      </w:r>
+      <w:r>
+        <w:t xml:space="preserve"> </w:t>
+      </w:r>
+      <w:r>
+        <w:t xml:space="preserve">al descartar, #12).</w:t>
+      </w:r>
+    </w:p>
+    <w:p>
+      <w:pPr>
+        <w:pStyle w:val="Compact"/>
+        <w:numPr>
+          <w:ilvl w:val="0"/>
+          <w:numId w:val="1002"/>
+        </w:numPr>
+      </w:pPr>
+      <w:r>
+        <w:rPr>
+          <w:b/>
+          <w:bCs/>
+        </w:rPr>
+        <w:t xml:space="preserve">Con cautela / flaco:</w:t>
+      </w:r>
+      <w:r>
+        <w:t xml:space="preserve"> </w:t>
+      </w:r>
+      <w:r>
+        <w:rPr>
+          <w:b/>
+          <w:bCs/>
+        </w:rPr>
+        <w:t xml:space="preserve">BLT</w:t>
+      </w:r>
+      <w:r>
+        <w:t xml:space="preserve"> </w:t>
+      </w:r>
+      <w:r>
+        <w:t xml:space="preserve">(footer falso</w:t>
+      </w:r>
+      <w:r>
+        <w:t xml:space="preserve"> </w:t>
+      </w:r>
+      <w:r>
+        <w:t xml:space="preserve">“el documento no incluye este dato”</w:t>
+      </w:r>
+      <w:r>
+        <w:t xml:space="preserve"> </w:t>
+      </w:r>
+      <w:r>
+        <w:t xml:space="preserve">en códigos de error #1/#2; mezcla con MediaCoder en puesta en marcha MPDK136, #7);</w:t>
+      </w:r>
+      <w:r>
+        <w:t xml:space="preserve"> </w:t>
+      </w:r>
+      <w:r>
+        <w:rPr>
+          <w:b/>
+          <w:bCs/>
+        </w:rPr>
+        <w:t xml:space="preserve">KONE</w:t>
+      </w:r>
+      <w:r>
+        <w:t xml:space="preserve"> </w:t>
+      </w:r>
+      <w:r>
+        <w:t xml:space="preserve">(sin terreno propio verificado — LCE sin evidencia desde Fase 1, LCB II es de OTIS);</w:t>
+      </w:r>
+      <w:r>
+        <w:t xml:space="preserve"> </w:t>
+      </w:r>
+      <w:r>
+        <w:rPr>
+          <w:b/>
+          <w:bCs/>
+        </w:rPr>
+        <w:t xml:space="preserve">Thyssen hidráulico</w:t>
+      </w:r>
+      <w:r>
+        <w:t xml:space="preserve"> </w:t>
+      </w:r>
+      <w:r>
+        <w:t xml:space="preserve">(declara ausencia en falla de llamada, #4);</w:t>
+      </w:r>
+      <w:r>
+        <w:t xml:space="preserve"> </w:t>
+      </w:r>
+      <w:r>
+        <w:rPr>
+          <w:b/>
+          <w:bCs/>
+        </w:rPr>
+        <w:t xml:space="preserve">planos Mitsubishi</w:t>
+      </w:r>
+      <w:r>
+        <w:t xml:space="preserve"> </w:t>
+      </w:r>
+      <w:r>
+        <w:t xml:space="preserve">(sin plano pinneado enumera Otis/CMC-3, #10);</w:t>
+      </w:r>
+      <w:r>
+        <w:t xml:space="preserve"> </w:t>
+      </w:r>
+      <w:r>
+        <w:rPr>
+          <w:b/>
+          <w:bCs/>
+        </w:rPr>
+        <w:t xml:space="preserve">WEG</w:t>
+      </w:r>
+      <w:r>
+        <w:t xml:space="preserve"> </w:t>
+      </w:r>
+      <w:r>
+        <w:t xml:space="preserve">(identifica el modelo, no entrega el paso a paso, #11).</w:t>
+      </w:r>
+    </w:p>
+    <w:bookmarkEnd w:id="22"/>
+    <w:bookmarkStart w:id="23" w:name="el-circuito-de-voz-del-certificador"/>
     <w:p>
       <w:pPr>
         <w:pStyle w:val="Heading3"/>
@@ -2516,8 +2850,8 @@
         <w:t xml:space="preserve">“Cuando tenías tu certificadora y hacías los informes tú mismo, ¿cuánto se te iba escribiendo el informe después de la visita?”</w:t>
       </w:r>
     </w:p>
-    <w:bookmarkEnd w:id="22"/>
-    <w:bookmarkStart w:id="23" w:name="descubrimiento"/>
+    <w:bookmarkEnd w:id="23"/>
+    <w:bookmarkStart w:id="24" w:name="descubrimiento"/>
     <w:p>
       <w:pPr>
         <w:pStyle w:val="Heading3"/>
@@ -2534,8 +2868,8 @@
         <w:t xml:space="preserve">Las preguntas de la sección 7.</w:t>
       </w:r>
     </w:p>
-    <w:bookmarkEnd w:id="23"/>
-    <w:bookmarkStart w:id="24" w:name="cierre-del-piloto"/>
+    <w:bookmarkEnd w:id="24"/>
+    <w:bookmarkStart w:id="25" w:name="cierre-del-piloto"/>
     <w:p>
       <w:pPr>
         <w:pStyle w:val="Heading3"/>
@@ -2568,8 +2902,8 @@
         <w:t xml:space="preserve">(Fiestas Patrias reduce disponibilidad).</w:t>
       </w:r>
     </w:p>
-    <w:bookmarkEnd w:id="24"/>
-    <w:bookmarkStart w:id="25" w:name="la-visión-y-solo-aquí"/>
+    <w:bookmarkEnd w:id="25"/>
+    <w:bookmarkStart w:id="26" w:name="la-visión-y-solo-aquí"/>
     <w:p>
       <w:pPr>
         <w:pStyle w:val="Heading3"/>
@@ -2593,9 +2927,9 @@
         </w:pict>
       </w:r>
     </w:p>
-    <w:bookmarkEnd w:id="25"/>
     <w:bookmarkEnd w:id="26"/>
-    <w:bookmarkStart w:id="29" w:name="sus-objeciones-y-la-respuesta-correcta"/>
+    <w:bookmarkEnd w:id="27"/>
+    <w:bookmarkStart w:id="30" w:name="sus-objeciones-y-la-respuesta-correcta"/>
     <w:p>
       <w:pPr>
         <w:pStyle w:val="Heading2"/>
@@ -2935,7 +3269,7 @@
         </w:tc>
       </w:tr>
     </w:tbl>
-    <w:bookmarkStart w:id="27" w:name="X9594890dbe983e666a0e1e57d16c52a1546f0be"/>
+    <w:bookmarkStart w:id="28" w:name="X9594890dbe983e666a0e1e57d16c52a1546f0be"/>
     <w:p>
       <w:pPr>
         <w:pStyle w:val="Heading3"/>
@@ -2988,8 +3322,8 @@
         <w:t xml:space="preserve">No la consulta al manual, que objetó. El valor que él ya reconoció es que el conocimiento quede en la empresa y sea multimarca.</w:t>
       </w:r>
     </w:p>
-    <w:bookmarkEnd w:id="27"/>
-    <w:bookmarkStart w:id="28" w:name="X3a2ee108f86881fdc0866e1b4dbb9f3c92ffb1e"/>
+    <w:bookmarkEnd w:id="28"/>
+    <w:bookmarkStart w:id="29" w:name="X3a2ee108f86881fdc0866e1b4dbb9f3c92ffb1e"/>
     <w:p>
       <w:pPr>
         <w:pStyle w:val="Heading3"/>
@@ -3058,9 +3392,9 @@
         </w:pict>
       </w:r>
     </w:p>
-    <w:bookmarkEnd w:id="28"/>
     <w:bookmarkEnd w:id="29"/>
-    <w:bookmarkStart w:id="30" w:name="Xb69ac432ffc9462e7b8817027e1fab568d1d82c"/>
+    <w:bookmarkEnd w:id="30"/>
+    <w:bookmarkStart w:id="31" w:name="Xb69ac432ffc9462e7b8817027e1fab568d1d82c"/>
     <w:p>
       <w:pPr>
         <w:pStyle w:val="Heading2"/>
@@ -3631,8 +3965,8 @@
         </w:pict>
       </w:r>
     </w:p>
-    <w:bookmarkEnd w:id="30"/>
-    <w:bookmarkStart w:id="31" w:name="X241869bde04d505b2a70f91bbc454c652eb5546"/>
+    <w:bookmarkEnd w:id="31"/>
+    <w:bookmarkStart w:id="32" w:name="X241869bde04d505b2a70f91bbc454c652eb5546"/>
     <w:p>
       <w:pPr>
         <w:pStyle w:val="Heading2"/>
@@ -4049,8 +4383,8 @@
         </w:pict>
       </w:r>
     </w:p>
-    <w:bookmarkEnd w:id="31"/>
-    <w:bookmarkStart w:id="32" w:name="Xbb79d8786507d4295234191da0d5ecd3305cc42"/>
+    <w:bookmarkEnd w:id="32"/>
+    <w:bookmarkStart w:id="33" w:name="Xbb79d8786507d4295234191da0d5ecd3305cc42"/>
     <w:p>
       <w:pPr>
         <w:pStyle w:val="Heading2"/>
@@ -4118,162 +4452,6 @@
           <w:bCs/>
         </w:rPr>
         <w:t xml:space="preserve">Cómo presentarla el viernes:</w:t>
-      </w:r>
-    </w:p>
-    <w:p>
-      <w:pPr>
-        <w:pStyle w:val="Compact"/>
-        <w:numPr>
-          <w:ilvl w:val="0"/>
-          <w:numId w:val="1002"/>
-        </w:numPr>
-      </w:pPr>
-      <w:r>
-        <w:rPr>
-          <w:b/>
-          <w:bCs/>
-        </w:rPr>
-        <w:t xml:space="preserve">El piloto se hace con lo que existe hoy</w:t>
-      </w:r>
-      <w:r>
-        <w:t xml:space="preserve">: consulta documental multimarca, fotos, evidencia citada y traza. La voz no condiciona el piloto ni se ofrece como parte de él.</w:t>
-      </w:r>
-    </w:p>
-    <w:p>
-      <w:pPr>
-        <w:pStyle w:val="Compact"/>
-        <w:numPr>
-          <w:ilvl w:val="0"/>
-          <w:numId w:val="1002"/>
-        </w:numPr>
-      </w:pPr>
-      <w:r>
-        <w:rPr>
-          <w:b/>
-          <w:bCs/>
-        </w:rPr>
-        <w:t xml:space="preserve">La visión se cuenta al final, en los últimos tres minutos</w:t>
-      </w:r>
-      <w:r>
-        <w:t xml:space="preserve">, después de tener nombre y fecha. No al principio.</w:t>
-      </w:r>
-    </w:p>
-    <w:p>
-      <w:pPr>
-        <w:pStyle w:val="Compact"/>
-        <w:numPr>
-          <w:ilvl w:val="0"/>
-          <w:numId w:val="1002"/>
-        </w:numPr>
-      </w:pPr>
-      <w:r>
-        <w:rPr>
-          <w:b/>
-          <w:bCs/>
-        </w:rPr>
-        <w:t xml:space="preserve">Se enuncia como visión, sin comprometer nada.</w:t>
-      </w:r>
-      <w:r>
-        <w:t xml:space="preserve"> </w:t>
-      </w:r>
-      <w:r>
-        <w:t xml:space="preserve">No hay fecha, no hay promesa, no hay alcance. La formulación es en primera persona y sobre el rumbo:</w:t>
-      </w:r>
-      <w:r>
-        <w:t xml:space="preserve"> </w:t>
-      </w:r>
-      <w:r>
-        <w:t xml:space="preserve">“hacia dónde va esto”</w:t>
-      </w:r>
-      <w:r>
-        <w:t xml:space="preserve">, no</w:t>
-      </w:r>
-      <w:r>
-        <w:t xml:space="preserve"> </w:t>
-      </w:r>
-      <w:r>
-        <w:t xml:space="preserve">“qué vas a recibir”</w:t>
-      </w:r>
-      <w:r>
-        <w:t xml:space="preserve">.</w:t>
-      </w:r>
-    </w:p>
-    <w:p>
-      <w:pPr>
-        <w:pStyle w:val="Compact"/>
-        <w:numPr>
-          <w:ilvl w:val="0"/>
-          <w:numId w:val="1002"/>
-        </w:numPr>
-      </w:pPr>
-      <w:r>
-        <w:t xml:space="preserve">Frase de la visión:</w:t>
-      </w:r>
-      <w:r>
-        <w:t xml:space="preserve"> </w:t>
-      </w:r>
-      <w:r>
-        <w:rPr>
-          <w:i/>
-          <w:iCs/>
-        </w:rPr>
-        <w:t xml:space="preserve">“Que el técnico deje el teléfono en el piso, pregunte hablando y la aplicación le conteste hablando y lo vaya guiando. Con guantes, con poca luz, sin soltar la herramienta. Eso es lo que ninguna herramienta del mercado hace hoy, y es hacia donde va Danebo.”</w:t>
-      </w:r>
-    </w:p>
-    <w:p>
-      <w:pPr>
-        <w:pStyle w:val="Compact"/>
-        <w:numPr>
-          <w:ilvl w:val="0"/>
-          <w:numId w:val="1002"/>
-        </w:numPr>
-      </w:pPr>
-      <w:r>
-        <w:rPr>
-          <w:b/>
-          <w:bCs/>
-        </w:rPr>
-        <w:t xml:space="preserve">Al servicio del piloto:</w:t>
-      </w:r>
-      <w:r>
-        <w:t xml:space="preserve"> </w:t>
-      </w:r>
-      <w:r>
-        <w:rPr>
-          <w:i/>
-          <w:iCs/>
-        </w:rPr>
-        <w:t xml:space="preserve">“Lo que me tiene indeciso es cuál de los tres módulos construyo a fondo primero — mantenedor, certificador, administrador. El piloto es lo que me lo dice.”</w:t>
-      </w:r>
-    </w:p>
-    <w:p>
-      <w:pPr>
-        <w:pStyle w:val="FirstParagraph"/>
-      </w:pPr>
-      <w:r>
-        <w:rPr>
-          <w:b/>
-          <w:bCs/>
-        </w:rPr>
-        <w:t xml:space="preserve">Si el circuito de voz del certificador está estable, mostrarlo es la mejor carta de la reunión.</w:t>
-      </w:r>
-      <w:r>
-        <w:t xml:space="preserve"> </w:t>
-      </w:r>
-      <w:r>
-        <w:t xml:space="preserve">No porque sea el producto del piloto, sino porque él ya vio el sistema de consulta y esto le muestra que hay una segunda capa avanzando. Con dos condiciones: cinco recorridos limpios probados hoy, y los límites declarados antes de tocar nada. Es una demostración de rumbo, no una oferta.</w:t>
-      </w:r>
-    </w:p>
-    <w:p>
-      <w:pPr>
-        <w:pStyle w:val="BodyText"/>
-      </w:pPr>
-      <w:r>
-        <w:rPr>
-          <w:b/>
-          <w:bCs/>
-        </w:rPr>
-        <w:t xml:space="preserve">Riesgos que hay que manejar:</w:t>
       </w:r>
     </w:p>
     <w:p>
@@ -4289,26 +4467,10 @@
           <w:b/>
           <w:bCs/>
         </w:rPr>
-        <w:t xml:space="preserve">No confundir los dos productos de voz.</w:t>
-      </w:r>
-      <w:r>
-        <w:t xml:space="preserve"> </w:t>
-      </w:r>
-      <w:r>
-        <w:t xml:space="preserve">El circuito del certificador (dictar → transcribir → confirmar → borrador) está en construcción. La voz conversacional manos libres del mantenedor</w:t>
-      </w:r>
-      <w:r>
-        <w:t xml:space="preserve"> </w:t>
-      </w:r>
-      <w:r>
-        <w:rPr>
-          <w:b/>
-          <w:bCs/>
-        </w:rPr>
-        <w:t xml:space="preserve">no existe</w:t>
-      </w:r>
-      <w:r>
-        <w:t xml:space="preserve">. Si él pregunta cuándo, la respuesta honesta es que depende de que el piloto muestre que vale la pena.</w:t>
+        <w:t xml:space="preserve">El piloto se hace con lo que existe hoy</w:t>
+      </w:r>
+      <w:r>
+        <w:t xml:space="preserve">: consulta documental multimarca, fotos, evidencia citada y traza. La voz no condiciona el piloto ni se ofrece como parte de él.</w:t>
       </w:r>
     </w:p>
     <w:p>
@@ -4324,13 +4486,10 @@
           <w:b/>
           <w:bCs/>
         </w:rPr>
-        <w:t xml:space="preserve">No prometer fechas.</w:t>
-      </w:r>
-      <w:r>
-        <w:t xml:space="preserve"> </w:t>
-      </w:r>
-      <w:r>
-        <w:t xml:space="preserve">Ninguna.</w:t>
+        <w:t xml:space="preserve">La visión se cuenta al final, en los últimos tres minutos</w:t>
+      </w:r>
+      <w:r>
+        <w:t xml:space="preserve">, después de tener nombre y fecha. No al principio.</w:t>
       </w:r>
     </w:p>
     <w:p>
@@ -4346,13 +4505,31 @@
           <w:b/>
           <w:bCs/>
         </w:rPr>
-        <w:t xml:space="preserve">La sorpresa vale una sola vez.</w:t>
-      </w:r>
-      <w:r>
-        <w:t xml:space="preserve"> </w:t>
-      </w:r>
-      <w:r>
-        <w:t xml:space="preserve">Si la juegas al inicio, la conversación se va a especular sobre módulos y no vuelve al piloto. Guárdala para el cierre, donde convierte el entusiasmo en razón para participar.</w:t>
+        <w:t xml:space="preserve">Se enuncia como visión, sin comprometer nada.</w:t>
+      </w:r>
+      <w:r>
+        <w:t xml:space="preserve"> </w:t>
+      </w:r>
+      <w:r>
+        <w:t xml:space="preserve">No hay fecha, no hay promesa, no hay alcance. La formulación es en primera persona y sobre el rumbo:</w:t>
+      </w:r>
+      <w:r>
+        <w:t xml:space="preserve"> </w:t>
+      </w:r>
+      <w:r>
+        <w:t xml:space="preserve">“hacia dónde va esto”</w:t>
+      </w:r>
+      <w:r>
+        <w:t xml:space="preserve">, no</w:t>
+      </w:r>
+      <w:r>
+        <w:t xml:space="preserve"> </w:t>
+      </w:r>
+      <w:r>
+        <w:t xml:space="preserve">“qué vas a recibir”</w:t>
+      </w:r>
+      <w:r>
+        <w:t xml:space="preserve">.</w:t>
       </w:r>
     </w:p>
     <w:p>
@@ -4364,6 +4541,163 @@
         </w:numPr>
       </w:pPr>
       <w:r>
+        <w:t xml:space="preserve">Frase de la visión:</w:t>
+      </w:r>
+      <w:r>
+        <w:t xml:space="preserve"> </w:t>
+      </w:r>
+      <w:r>
+        <w:rPr>
+          <w:i/>
+          <w:iCs/>
+        </w:rPr>
+        <w:t xml:space="preserve">“Que el técnico deje el teléfono en el piso, pregunte hablando y la aplicación le conteste hablando y lo vaya guiando. Con guantes, con poca luz, sin soltar la herramienta. Eso es lo que ninguna herramienta del mercado hace hoy, y es hacia donde va Danebo.”</w:t>
+      </w:r>
+    </w:p>
+    <w:p>
+      <w:pPr>
+        <w:pStyle w:val="Compact"/>
+        <w:numPr>
+          <w:ilvl w:val="0"/>
+          <w:numId w:val="1003"/>
+        </w:numPr>
+      </w:pPr>
+      <w:r>
+        <w:rPr>
+          <w:b/>
+          <w:bCs/>
+        </w:rPr>
+        <w:t xml:space="preserve">Al servicio del piloto:</w:t>
+      </w:r>
+      <w:r>
+        <w:t xml:space="preserve"> </w:t>
+      </w:r>
+      <w:r>
+        <w:rPr>
+          <w:i/>
+          <w:iCs/>
+        </w:rPr>
+        <w:t xml:space="preserve">“Lo que me tiene indeciso es cuál de los tres módulos construyo a fondo primero — mantenedor, certificador, administrador. El piloto es lo que me lo dice.”</w:t>
+      </w:r>
+    </w:p>
+    <w:p>
+      <w:pPr>
+        <w:pStyle w:val="FirstParagraph"/>
+      </w:pPr>
+      <w:r>
+        <w:rPr>
+          <w:b/>
+          <w:bCs/>
+        </w:rPr>
+        <w:t xml:space="preserve">Si el circuito de voz del certificador está estable, mostrarlo es la mejor carta de la reunión.</w:t>
+      </w:r>
+      <w:r>
+        <w:t xml:space="preserve"> </w:t>
+      </w:r>
+      <w:r>
+        <w:t xml:space="preserve">No porque sea el producto del piloto, sino porque él ya vio el sistema de consulta y esto le muestra que hay una segunda capa avanzando. Con dos condiciones: cinco recorridos limpios probados hoy, y los límites declarados antes de tocar nada. Es una demostración de rumbo, no una oferta.</w:t>
+      </w:r>
+    </w:p>
+    <w:p>
+      <w:pPr>
+        <w:pStyle w:val="BodyText"/>
+      </w:pPr>
+      <w:r>
+        <w:rPr>
+          <w:b/>
+          <w:bCs/>
+        </w:rPr>
+        <w:t xml:space="preserve">Riesgos que hay que manejar:</w:t>
+      </w:r>
+    </w:p>
+    <w:p>
+      <w:pPr>
+        <w:pStyle w:val="Compact"/>
+        <w:numPr>
+          <w:ilvl w:val="0"/>
+          <w:numId w:val="1004"/>
+        </w:numPr>
+      </w:pPr>
+      <w:r>
+        <w:rPr>
+          <w:b/>
+          <w:bCs/>
+        </w:rPr>
+        <w:t xml:space="preserve">No confundir los dos productos de voz.</w:t>
+      </w:r>
+      <w:r>
+        <w:t xml:space="preserve"> </w:t>
+      </w:r>
+      <w:r>
+        <w:t xml:space="preserve">El circuito del certificador (dictar → transcribir → confirmar → borrador) está en construcción. La voz conversacional manos libres del mantenedor</w:t>
+      </w:r>
+      <w:r>
+        <w:t xml:space="preserve"> </w:t>
+      </w:r>
+      <w:r>
+        <w:rPr>
+          <w:b/>
+          <w:bCs/>
+        </w:rPr>
+        <w:t xml:space="preserve">no existe</w:t>
+      </w:r>
+      <w:r>
+        <w:t xml:space="preserve">. Si él pregunta cuándo, la respuesta honesta es que depende de que el piloto muestre que vale la pena.</w:t>
+      </w:r>
+    </w:p>
+    <w:p>
+      <w:pPr>
+        <w:pStyle w:val="Compact"/>
+        <w:numPr>
+          <w:ilvl w:val="0"/>
+          <w:numId w:val="1004"/>
+        </w:numPr>
+      </w:pPr>
+      <w:r>
+        <w:rPr>
+          <w:b/>
+          <w:bCs/>
+        </w:rPr>
+        <w:t xml:space="preserve">No prometer fechas.</w:t>
+      </w:r>
+      <w:r>
+        <w:t xml:space="preserve"> </w:t>
+      </w:r>
+      <w:r>
+        <w:t xml:space="preserve">Ninguna.</w:t>
+      </w:r>
+    </w:p>
+    <w:p>
+      <w:pPr>
+        <w:pStyle w:val="Compact"/>
+        <w:numPr>
+          <w:ilvl w:val="0"/>
+          <w:numId w:val="1004"/>
+        </w:numPr>
+      </w:pPr>
+      <w:r>
+        <w:rPr>
+          <w:b/>
+          <w:bCs/>
+        </w:rPr>
+        <w:t xml:space="preserve">La sorpresa vale una sola vez.</w:t>
+      </w:r>
+      <w:r>
+        <w:t xml:space="preserve"> </w:t>
+      </w:r>
+      <w:r>
+        <w:t xml:space="preserve">Si la juegas al inicio, la conversación se va a especular sobre módulos y no vuelve al piloto. Guárdala para el cierre, donde convierte el entusiasmo en razón para participar.</w:t>
+      </w:r>
+    </w:p>
+    <w:p>
+      <w:pPr>
+        <w:pStyle w:val="Compact"/>
+        <w:numPr>
+          <w:ilvl w:val="0"/>
+          <w:numId w:val="1004"/>
+        </w:numPr>
+      </w:pPr>
+      <w:r>
         <w:rPr>
           <w:b/>
           <w:bCs/>
@@ -4384,8 +4718,8 @@
         </w:pict>
       </w:r>
     </w:p>
-    <w:bookmarkEnd w:id="32"/>
-    <w:bookmarkStart w:id="38" w:name="el-corpus-qué-es-de-quién-y-qué-decirle"/>
+    <w:bookmarkEnd w:id="33"/>
+    <w:bookmarkStart w:id="39" w:name="el-corpus-qué-es-de-quién-y-qué-decirle"/>
     <w:p>
       <w:pPr>
         <w:pStyle w:val="Heading2"/>
@@ -4394,7 +4728,7 @@
         <w:t xml:space="preserve">10. El corpus: qué es de quién, y qué decirle</w:t>
       </w:r>
     </w:p>
-    <w:bookmarkStart w:id="33" w:name="la-separación-que-hay-que-tener-clara"/>
+    <w:bookmarkStart w:id="34" w:name="la-separación-que-hay-que-tener-clara"/>
     <w:p>
       <w:pPr>
         <w:pStyle w:val="Heading3"/>
@@ -4595,8 +4929,8 @@
         <w:t xml:space="preserve">Es tu costo de procesamiento. Y no crea una deuda de Gonzalo ni un derecho tuyo sobre su aporte.</w:t>
       </w:r>
     </w:p>
-    <w:bookmarkEnd w:id="33"/>
-    <w:bookmarkStart w:id="34" w:name="qué-decirle-y-por-qué-conviene"/>
+    <w:bookmarkEnd w:id="34"/>
+    <w:bookmarkStart w:id="35" w:name="qué-decirle-y-por-qué-conviene"/>
     <w:p>
       <w:pPr>
         <w:pStyle w:val="Heading3"/>
@@ -4655,8 +4989,8 @@
         <w:t xml:space="preserve">que se entere después de que reutilizaste su biblioteca. Preguntar ahora es la única opción, y hoy es el mejor momento porque todavía no hay ningún cliente que lo necesite.</w:t>
       </w:r>
     </w:p>
-    <w:bookmarkEnd w:id="34"/>
-    <w:bookmarkStart w:id="35" w:name="X0839e5772b7546b9a92c7df71ae69b326b65d3a"/>
+    <w:bookmarkEnd w:id="35"/>
+    <w:bookmarkStart w:id="36" w:name="X0839e5772b7546b9a92c7df71ae69b326b65d3a"/>
     <w:p>
       <w:pPr>
         <w:pStyle w:val="Heading3"/>
@@ -4717,8 +5051,8 @@
         <w:t xml:space="preserve">Sin dólares. Sin reclamo. Si él ofrece cargar el resto: primero probemos con lo que hay y midamos qué no encuentra.</w:t>
       </w:r>
     </w:p>
-    <w:bookmarkEnd w:id="35"/>
-    <w:bookmarkStart w:id="36" w:name="si-se-retira-de-la-mesa"/>
+    <w:bookmarkEnd w:id="36"/>
+    <w:bookmarkStart w:id="37" w:name="si-se-retira-de-la-mesa"/>
     <w:p>
       <w:pPr>
         <w:pStyle w:val="Heading3"/>
@@ -4760,8 +5094,8 @@
         <w:t xml:space="preserve">convierte un problema de relación en un problema legal, con material de fabricantes de por medio. El dinero está perdido: fue una decisión propia y no se usa nunca como argumento con él.</w:t>
       </w:r>
     </w:p>
-    <w:bookmarkEnd w:id="36"/>
-    <w:bookmarkStart w:id="37" w:name="Xa226771396f427a9b42d4c705441a70ee754a22"/>
+    <w:bookmarkEnd w:id="37"/>
+    <w:bookmarkStart w:id="38" w:name="Xa226771396f427a9b42d4c705441a70ee754a22"/>
     <w:p>
       <w:pPr>
         <w:pStyle w:val="Heading3"/>
@@ -4784,193 +5118,6 @@
       </w:pPr>
       <w:r>
         <w:t xml:space="preserve">Tres condiciones antes de convertirlo en argumento comercial:</w:t>
-      </w:r>
-    </w:p>
-    <w:p>
-      <w:pPr>
-        <w:pStyle w:val="Compact"/>
-        <w:numPr>
-          <w:ilvl w:val="0"/>
-          <w:numId w:val="1004"/>
-        </w:numPr>
-      </w:pPr>
-      <w:r>
-        <w:rPr>
-          <w:b/>
-          <w:bCs/>
-        </w:rPr>
-        <w:t xml:space="preserve">Permiso escrito de Gonzalo</w:t>
-      </w:r>
-      <w:r>
-        <w:t xml:space="preserve">, con alcance, retención y borrado.</w:t>
-      </w:r>
-    </w:p>
-    <w:p>
-      <w:pPr>
-        <w:pStyle w:val="Compact"/>
-        <w:numPr>
-          <w:ilvl w:val="0"/>
-          <w:numId w:val="1004"/>
-        </w:numPr>
-      </w:pPr>
-      <w:r>
-        <w:rPr>
-          <w:b/>
-          <w:bCs/>
-        </w:rPr>
-        <w:t xml:space="preserve">Revisión legal de propiedad intelectual.</w:t>
-      </w:r>
-      <w:r>
-        <w:t xml:space="preserve"> </w:t>
-      </w:r>
-      <w:r>
-        <w:t xml:space="preserve">Compartir manuales de fabricante entre clientes es una pregunta de los fabricantes, no de Gonzalo. Su permiso es necesario y no suficiente.</w:t>
-      </w:r>
-    </w:p>
-    <w:p>
-      <w:pPr>
-        <w:pStyle w:val="Compact"/>
-        <w:numPr>
-          <w:ilvl w:val="0"/>
-          <w:numId w:val="1004"/>
-        </w:numPr>
-      </w:pPr>
-      <w:r>
-        <w:rPr>
-          <w:b/>
-          <w:bCs/>
-        </w:rPr>
-        <w:t xml:space="preserve">Fuentes alternativas</w:t>
-      </w:r>
-      <w:r>
-        <w:t xml:space="preserve">, para que la base común no dependa de una sola persona: hermanos con Orona, otros técnicos, clientes que aporten los suyos, sitios de pago. Hay que construirlas pase lo que pase.</w:t>
-      </w:r>
-    </w:p>
-    <w:p>
-      <w:pPr>
-        <w:pStyle w:val="FirstParagraph"/>
-      </w:pPr>
-      <w:r>
-        <w:rPr>
-          <w:b/>
-          <w:bCs/>
-        </w:rPr>
-        <w:t xml:space="preserve">Cuánto falta para cubrir el grueso del parque chileno:</w:t>
-      </w:r>
-      <w:r>
-        <w:t xml:space="preserve"> </w:t>
-      </w:r>
-      <w:r>
-        <w:t xml:space="preserve">Schindler, Hyundai, Fermator y variadores suman 9.150 páginas, unos US$243 al costo medido.</w:t>
-      </w:r>
-      <w:r>
-        <w:t xml:space="preserve"> </w:t>
-      </w:r>
-      <w:r>
-        <w:rPr>
-          <w:b/>
-          <w:bCs/>
-        </w:rPr>
-        <w:t xml:space="preserve">No se gasta ahora:</w:t>
-      </w:r>
-      <w:r>
-        <w:t xml:space="preserve"> </w:t>
-      </w:r>
-      <w:r>
-        <w:t xml:space="preserve">el Plan de Septiembre fija cero compra de corpus hasta el 2 de octubre, y el dato que justifica ese gasto lo produce el piloto — qué porcentaje de consultas cae en</w:t>
-      </w:r>
-      <w:r>
-        <w:t xml:space="preserve"> </w:t>
-      </w:r>
-      <w:r>
-        <w:t xml:space="preserve">“no hay evidencia”</w:t>
-      </w:r>
-      <w:r>
-        <w:t xml:space="preserve"> </w:t>
-      </w:r>
-      <w:r>
-        <w:t xml:space="preserve">y de qué marcas. Que las seis marcas cubran el 80% de las consultas es hipótesis, no dato.</w:t>
-      </w:r>
-    </w:p>
-    <w:p>
-      <w:r>
-        <w:pict>
-          <v:rect style="width:0;height:1.5pt" o:hralign="center" o:hrstd="t" o:hr="t"/>
-        </w:pict>
-      </w:r>
-    </w:p>
-    <w:bookmarkEnd w:id="37"/>
-    <w:bookmarkEnd w:id="38"/>
-    <w:bookmarkStart w:id="43" w:name="precio-activación-y-modelo-de-negocio"/>
-    <w:p>
-      <w:pPr>
-        <w:pStyle w:val="Heading2"/>
-      </w:pPr>
-      <w:r>
-        <w:t xml:space="preserve">11. Precio, activación y modelo de negocio</w:t>
-      </w:r>
-    </w:p>
-    <w:bookmarkStart w:id="39" w:name="X367081f1e7d9b06bf60efe6ebb11f104ab725c1"/>
-    <w:p>
-      <w:pPr>
-        <w:pStyle w:val="Heading3"/>
-      </w:pPr>
-      <w:r>
-        <w:t xml:space="preserve">Qué cubre la activación, y se puede decir sin cifra</w:t>
-      </w:r>
-    </w:p>
-    <w:p>
-      <w:pPr>
-        <w:pStyle w:val="FirstParagraph"/>
-      </w:pPr>
-      <w:r>
-        <w:t xml:space="preserve">No es solo indexar: es crear la cuenta aislada, los usuarios nominales por técnico, y el subdominio propio del cliente. Existe ya un cliente corriendo en su propio subdominio. Apuntar el dominio propio del cliente es posible y requiere trabajo manual.</w:t>
-      </w:r>
-    </w:p>
-    <w:p>
-      <w:pPr>
-        <w:pStyle w:val="BlockText"/>
-      </w:pPr>
-      <w:r>
-        <w:t xml:space="preserve">“La activación no es solo cargar manuales. Es dejar a tu empresa con su propio espacio: usuarios por técnico, biblioteca aislada, y si quieres en su propio dominio. Ya tengo un cliente corriendo así. Eso se cobra aparte del uso mensual, porque es trabajo por empresa.”</w:t>
-      </w:r>
-    </w:p>
-    <w:p>
-      <w:pPr>
-        <w:pStyle w:val="FirstParagraph"/>
-      </w:pPr>
-      <w:r>
-        <w:t xml:space="preserve">No prometer el dominio propio como inmediato ni como autoservicio.</w:t>
-      </w:r>
-    </w:p>
-    <w:bookmarkEnd w:id="39"/>
-    <w:bookmarkStart w:id="40" w:name="si-quiere-hablar-del-modelo-de-negocio"/>
-    <w:p>
-      <w:pPr>
-        <w:pStyle w:val="Heading3"/>
-      </w:pPr>
-      <w:r>
-        <w:t xml:space="preserve">Si quiere hablar del modelo de negocio</w:t>
-      </w:r>
-    </w:p>
-    <w:p>
-      <w:pPr>
-        <w:pStyle w:val="FirstParagraph"/>
-      </w:pPr>
-      <w:r>
-        <w:t xml:space="preserve">No lo esquives —él ofreció ayudar y esquivarlo se lee como no tener respuesta— y no abras números. Cambias de rol: en vez de contestar, preguntas.</w:t>
-      </w:r>
-    </w:p>
-    <w:p>
-      <w:pPr>
-        <w:pStyle w:val="BlockText"/>
-        <w:numPr>
-          <w:ilvl w:val="0"/>
-          <w:numId w:val="1005"/>
-        </w:numPr>
-      </w:pPr>
-      <w:r>
-        <w:t xml:space="preserve">“Justo eso quiero resolver bien. He visto tres formas de cobrar esto: por técnico, por equipo en cartera, o por informe generado. Tú conoces el mercado mejor que yo: ¿cuál crees que una mantenedora acepta, y en qué rango?”</w:t>
       </w:r>
     </w:p>
     <w:p>
@@ -4982,13 +5129,14 @@
         </w:numPr>
       </w:pPr>
       <w:r>
-        <w:t xml:space="preserve">Si insiste: &gt;</w:t>
-      </w:r>
-      <w:r>
-        <w:t xml:space="preserve"> </w:t>
-      </w:r>
-      <w:r>
-        <w:t xml:space="preserve">“Todavía no está decidido, y no es evasiva: el costo real lo estoy midiendo y falta el de la voz. Fijarlo antes de medirlo sería inventarlo. Por eso te pregunto a ti.”</w:t>
+        <w:rPr>
+          <w:b/>
+          <w:bCs/>
+        </w:rPr>
+        <w:t xml:space="preserve">Permiso escrito de Gonzalo</w:t>
+      </w:r>
+      <w:r>
+        <w:t xml:space="preserve">, con alcance, retención y borrado.</w:t>
       </w:r>
     </w:p>
     <w:p>
@@ -5000,13 +5148,17 @@
         </w:numPr>
       </w:pPr>
       <w:r>
-        <w:t xml:space="preserve">Si vuelve a insistir: &gt;</w:t>
-      </w:r>
-      <w:r>
-        <w:t xml:space="preserve"> </w:t>
-      </w:r>
-      <w:r>
-        <w:t xml:space="preserve">“Te lo digo en octubre, con el costo medido y el resultado de una prueba real encima.”</w:t>
+        <w:rPr>
+          <w:b/>
+          <w:bCs/>
+        </w:rPr>
+        <w:t xml:space="preserve">Revisión legal de propiedad intelectual.</w:t>
+      </w:r>
+      <w:r>
+        <w:t xml:space="preserve"> </w:t>
+      </w:r>
+      <w:r>
+        <w:t xml:space="preserve">Compartir manuales de fabricante entre clientes es una pregunta de los fabricantes, no de Gonzalo. Su permiso es necesario y no suficiente.</w:t>
       </w:r>
     </w:p>
     <w:p>
@@ -5018,23 +5170,141 @@
         </w:numPr>
       </w:pPr>
       <w:r>
-        <w:t xml:space="preserve">Puente: &gt;</w:t>
-      </w:r>
-      <w:r>
-        <w:t xml:space="preserve"> </w:t>
-      </w:r>
-      <w:r>
-        <w:t xml:space="preserve">“De hecho, el modelo lo define lo que aprenda del piloto: cuántas consultas usa un técnico al mes, qué encuentra y qué no. Armemos la prueba y el modelo lo conversamos con datos.”</w:t>
+        <w:rPr>
+          <w:b/>
+          <w:bCs/>
+        </w:rPr>
+        <w:t xml:space="preserve">Fuentes alternativas</w:t>
+      </w:r>
+      <w:r>
+        <w:t xml:space="preserve">, para que la base común no dependa de una sola persona: hermanos con Orona, otros técnicos, clientes que aporten los suyos, sitios de pago. Hay que construirlas pase lo que pase.</w:t>
+      </w:r>
+    </w:p>
+    <w:p>
+      <w:pPr>
+        <w:pStyle w:val="FirstParagraph"/>
+      </w:pPr>
+      <w:r>
+        <w:rPr>
+          <w:b/>
+          <w:bCs/>
+        </w:rPr>
+        <w:t xml:space="preserve">Cuánto falta para cubrir el grueso del parque chileno:</w:t>
+      </w:r>
+      <w:r>
+        <w:t xml:space="preserve"> </w:t>
+      </w:r>
+      <w:r>
+        <w:t xml:space="preserve">Schindler, Hyundai, Fermator y variadores suman 9.150 páginas, unos US$243 al costo medido.</w:t>
+      </w:r>
+      <w:r>
+        <w:t xml:space="preserve"> </w:t>
+      </w:r>
+      <w:r>
+        <w:rPr>
+          <w:b/>
+          <w:bCs/>
+        </w:rPr>
+        <w:t xml:space="preserve">No se gasta ahora:</w:t>
+      </w:r>
+      <w:r>
+        <w:t xml:space="preserve"> </w:t>
+      </w:r>
+      <w:r>
+        <w:t xml:space="preserve">el Plan de Septiembre fija cero compra de corpus hasta el 2 de octubre, y el dato que justifica ese gasto lo produce el piloto — qué porcentaje de consultas cae en</w:t>
+      </w:r>
+      <w:r>
+        <w:t xml:space="preserve"> </w:t>
+      </w:r>
+      <w:r>
+        <w:t xml:space="preserve">“no hay evidencia”</w:t>
+      </w:r>
+      <w:r>
+        <w:t xml:space="preserve"> </w:t>
+      </w:r>
+      <w:r>
+        <w:t xml:space="preserve">y de qué marcas. Que las seis marcas cubran el 80% de las consultas es hipótesis, no dato.</w:t>
+      </w:r>
+    </w:p>
+    <w:p>
+      <w:r>
+        <w:pict>
+          <v:rect style="width:0;height:1.5pt" o:hralign="center" o:hrstd="t" o:hr="t"/>
+        </w:pict>
+      </w:r>
+    </w:p>
+    <w:bookmarkEnd w:id="38"/>
+    <w:bookmarkEnd w:id="39"/>
+    <w:bookmarkStart w:id="44" w:name="precio-activación-y-modelo-de-negocio"/>
+    <w:p>
+      <w:pPr>
+        <w:pStyle w:val="Heading2"/>
+      </w:pPr>
+      <w:r>
+        <w:t xml:space="preserve">11. Precio, activación y modelo de negocio</w:t>
+      </w:r>
+    </w:p>
+    <w:bookmarkStart w:id="40" w:name="X367081f1e7d9b06bf60efe6ebb11f104ab725c1"/>
+    <w:p>
+      <w:pPr>
+        <w:pStyle w:val="Heading3"/>
+      </w:pPr>
+      <w:r>
+        <w:t xml:space="preserve">Qué cubre la activación, y se puede decir sin cifra</w:t>
+      </w:r>
+    </w:p>
+    <w:p>
+      <w:pPr>
+        <w:pStyle w:val="FirstParagraph"/>
+      </w:pPr>
+      <w:r>
+        <w:t xml:space="preserve">No es solo indexar: es crear la cuenta aislada, los usuarios nominales por técnico, y el subdominio propio del cliente. Existe ya un cliente corriendo en su propio subdominio. Apuntar el dominio propio del cliente es posible y requiere trabajo manual.</w:t>
+      </w:r>
+    </w:p>
+    <w:p>
+      <w:pPr>
+        <w:pStyle w:val="BlockText"/>
+      </w:pPr>
+      <w:r>
+        <w:t xml:space="preserve">“La activación no es solo cargar manuales. Es dejar a tu empresa con su propio espacio: usuarios por técnico, biblioteca aislada, y si quieres en su propio dominio. Ya tengo un cliente corriendo así. Eso se cobra aparte del uso mensual, porque es trabajo por empresa.”</w:t>
+      </w:r>
+    </w:p>
+    <w:p>
+      <w:pPr>
+        <w:pStyle w:val="FirstParagraph"/>
+      </w:pPr>
+      <w:r>
+        <w:t xml:space="preserve">No prometer el dominio propio como inmediato ni como autoservicio.</w:t>
       </w:r>
     </w:p>
     <w:bookmarkEnd w:id="40"/>
-    <w:bookmarkStart w:id="41" w:name="por-qué-no-se-abren-los-números"/>
+    <w:bookmarkStart w:id="41" w:name="si-quiere-hablar-del-modelo-de-negocio"/>
     <w:p>
       <w:pPr>
         <w:pStyle w:val="Heading3"/>
       </w:pPr>
       <w:r>
-        <w:t xml:space="preserve">Por qué no se abren los números</w:t>
+        <w:t xml:space="preserve">Si quiere hablar del modelo de negocio</w:t>
+      </w:r>
+    </w:p>
+    <w:p>
+      <w:pPr>
+        <w:pStyle w:val="FirstParagraph"/>
+      </w:pPr>
+      <w:r>
+        <w:t xml:space="preserve">No lo esquives —él ofreció ayudar y esquivarlo se lee como no tener respuesta— y no abras números. Cambias de rol: en vez de contestar, preguntas.</w:t>
+      </w:r>
+    </w:p>
+    <w:p>
+      <w:pPr>
+        <w:pStyle w:val="BlockText"/>
+        <w:numPr>
+          <w:ilvl w:val="0"/>
+          <w:numId w:val="1006"/>
+        </w:numPr>
+      </w:pPr>
+      <w:r>
+        <w:t xml:space="preserve">“Justo eso quiero resolver bien. He visto tres formas de cobrar esto: por técnico, por equipo en cartera, o por informe generado. Tú conoces el mercado mejor que yo: ¿cuál crees que una mantenedora acepta, y en qué rango?”</w:t>
       </w:r>
     </w:p>
     <w:p>
@@ -5046,17 +5316,13 @@
         </w:numPr>
       </w:pPr>
       <w:r>
-        <w:rPr>
-          <w:b/>
-          <w:bCs/>
-        </w:rPr>
-        <w:t xml:space="preserve">No están decididos.</w:t>
-      </w:r>
-      <w:r>
-        <w:t xml:space="preserve"> </w:t>
-      </w:r>
-      <w:r>
-        <w:t xml:space="preserve">El COGS de voz no está medido; el margen del modelo por informe es una expectativa, no un número.</w:t>
+        <w:t xml:space="preserve">Si insiste: &gt;</w:t>
+      </w:r>
+      <w:r>
+        <w:t xml:space="preserve"> </w:t>
+      </w:r>
+      <w:r>
+        <w:t xml:space="preserve">“Todavía no está decidido, y no es evasiva: el costo real lo estoy midiendo y falta el de la voz. Fijarlo antes de medirlo sería inventarlo. Por eso te pregunto a ti.”</w:t>
       </w:r>
     </w:p>
     <w:p>
@@ -5068,17 +5334,13 @@
         </w:numPr>
       </w:pPr>
       <w:r>
-        <w:rPr>
-          <w:b/>
-          <w:bCs/>
-        </w:rPr>
-        <w:t xml:space="preserve">Él es el gerente comercial de una mantenedora, o sea de un cliente potencial.</w:t>
-      </w:r>
-      <w:r>
-        <w:t xml:space="preserve"> </w:t>
-      </w:r>
-      <w:r>
-        <w:t xml:space="preserve">Es la última persona a la que se le revela precio antes de tenerlo decidido. Su oficio es negociar precios en este mercado, y una cifra dicha hoy queda como ancla para siempre.</w:t>
+        <w:t xml:space="preserve">Si vuelve a insistir: &gt;</w:t>
+      </w:r>
+      <w:r>
+        <w:t xml:space="preserve"> </w:t>
+      </w:r>
+      <w:r>
+        <w:t xml:space="preserve">“Te lo digo en octubre, con el costo medido y el resultado de una prueba real encima.”</w:t>
       </w:r>
     </w:p>
     <w:p>
@@ -5090,6 +5352,78 @@
         </w:numPr>
       </w:pPr>
       <w:r>
+        <w:t xml:space="preserve">Puente: &gt;</w:t>
+      </w:r>
+      <w:r>
+        <w:t xml:space="preserve"> </w:t>
+      </w:r>
+      <w:r>
+        <w:t xml:space="preserve">“De hecho, el modelo lo define lo que aprenda del piloto: cuántas consultas usa un técnico al mes, qué encuentra y qué no. Armemos la prueba y el modelo lo conversamos con datos.”</w:t>
+      </w:r>
+    </w:p>
+    <w:bookmarkEnd w:id="41"/>
+    <w:bookmarkStart w:id="42" w:name="por-qué-no-se-abren-los-números"/>
+    <w:p>
+      <w:pPr>
+        <w:pStyle w:val="Heading3"/>
+      </w:pPr>
+      <w:r>
+        <w:t xml:space="preserve">Por qué no se abren los números</w:t>
+      </w:r>
+    </w:p>
+    <w:p>
+      <w:pPr>
+        <w:pStyle w:val="Compact"/>
+        <w:numPr>
+          <w:ilvl w:val="0"/>
+          <w:numId w:val="1007"/>
+        </w:numPr>
+      </w:pPr>
+      <w:r>
+        <w:rPr>
+          <w:b/>
+          <w:bCs/>
+        </w:rPr>
+        <w:t xml:space="preserve">No están decididos.</w:t>
+      </w:r>
+      <w:r>
+        <w:t xml:space="preserve"> </w:t>
+      </w:r>
+      <w:r>
+        <w:t xml:space="preserve">El COGS de voz no está medido; el margen del modelo por informe es una expectativa, no un número.</w:t>
+      </w:r>
+    </w:p>
+    <w:p>
+      <w:pPr>
+        <w:pStyle w:val="Compact"/>
+        <w:numPr>
+          <w:ilvl w:val="0"/>
+          <w:numId w:val="1007"/>
+        </w:numPr>
+      </w:pPr>
+      <w:r>
+        <w:rPr>
+          <w:b/>
+          <w:bCs/>
+        </w:rPr>
+        <w:t xml:space="preserve">Él es el gerente comercial de una mantenedora, o sea de un cliente potencial.</w:t>
+      </w:r>
+      <w:r>
+        <w:t xml:space="preserve"> </w:t>
+      </w:r>
+      <w:r>
+        <w:t xml:space="preserve">Es la última persona a la que se le revela precio antes de tenerlo decidido. Su oficio es negociar precios en este mercado, y una cifra dicha hoy queda como ancla para siempre.</w:t>
+      </w:r>
+    </w:p>
+    <w:p>
+      <w:pPr>
+        <w:pStyle w:val="Compact"/>
+        <w:numPr>
+          <w:ilvl w:val="0"/>
+          <w:numId w:val="1007"/>
+        </w:numPr>
+      </w:pPr>
+      <w:r>
         <w:rPr>
           <w:b/>
           <w:bCs/>
@@ -5103,8 +5437,8 @@
         <w:t xml:space="preserve">y se escribió antes de esta reunión: se preguntan precios, no se proponen.</w:t>
       </w:r>
     </w:p>
-    <w:bookmarkEnd w:id="41"/>
-    <w:bookmarkStart w:id="42" w:name="X3100066390d5c6979f3aeafbb4c6c45206884e3"/>
+    <w:bookmarkEnd w:id="42"/>
+    <w:bookmarkStart w:id="43" w:name="X3100066390d5c6979f3aeafbb4c6c45206884e3"/>
     <w:p>
       <w:pPr>
         <w:pStyle w:val="Heading3"/>
@@ -5464,233 +5798,15 @@
         </w:pict>
       </w:r>
     </w:p>
-    <w:bookmarkEnd w:id="42"/>
     <w:bookmarkEnd w:id="43"/>
-    <w:bookmarkStart w:id="44" w:name="qué-no-decir"/>
+    <w:bookmarkEnd w:id="44"/>
+    <w:bookmarkStart w:id="45" w:name="qué-no-decir"/>
     <w:p>
       <w:pPr>
         <w:pStyle w:val="Heading2"/>
       </w:pPr>
       <w:r>
         <w:t xml:space="preserve">12. Qué NO decir</w:t>
-      </w:r>
-    </w:p>
-    <w:p>
-      <w:pPr>
-        <w:pStyle w:val="Compact"/>
-        <w:numPr>
-          <w:ilvl w:val="0"/>
-          <w:numId w:val="1007"/>
-        </w:numPr>
-      </w:pPr>
-      <w:r>
-        <w:t xml:space="preserve">Precio propio, COGS, los US$255,21, el runway, cifras de caja.</w:t>
-      </w:r>
-    </w:p>
-    <w:p>
-      <w:pPr>
-        <w:pStyle w:val="Compact"/>
-        <w:numPr>
-          <w:ilvl w:val="0"/>
-          <w:numId w:val="1007"/>
-        </w:numPr>
-      </w:pPr>
-      <w:r>
-        <w:t xml:space="preserve">CORFO. Si pregunta por fondos:</w:t>
-      </w:r>
-      <w:r>
-        <w:t xml:space="preserve"> </w:t>
-      </w:r>
-      <w:r>
-        <w:rPr>
-          <w:i/>
-          <w:iCs/>
-        </w:rPr>
-        <w:t xml:space="preserve">“Postulé a Start-Up Chile en mayo, no quedó. El feedback fue claro: faltaba validación comercial. Vuelvo a postular cuando tenga uso real y ojalá un cliente pagando.”</w:t>
-      </w:r>
-      <w:r>
-        <w:t xml:space="preserve"> </w:t>
-      </w:r>
-      <w:r>
-        <w:t xml:space="preserve">Sin montos, sin sueldos, sin</w:t>
-      </w:r>
-      <w:r>
-        <w:t xml:space="preserve"> </w:t>
-      </w:r>
-      <w:r>
-        <w:t xml:space="preserve">“si tú participas”</w:t>
-      </w:r>
-      <w:r>
-        <w:t xml:space="preserve">.</w:t>
-      </w:r>
-    </w:p>
-    <w:p>
-      <w:pPr>
-        <w:pStyle w:val="Compact"/>
-        <w:numPr>
-          <w:ilvl w:val="0"/>
-          <w:numId w:val="1007"/>
-        </w:numPr>
-      </w:pPr>
-      <w:r>
-        <w:t xml:space="preserve">Expansión regional. Si pregunta por crecimiento:</w:t>
-      </w:r>
-      <w:r>
-        <w:t xml:space="preserve"> </w:t>
-      </w:r>
-      <w:r>
-        <w:rPr>
-          <w:i/>
-          <w:iCs/>
-        </w:rPr>
-        <w:t xml:space="preserve">“Chile primero, con ascensores. El motor de dictar, confirmar y dejar un informe trazable sirve para otros servicios regulados de terreno, pero eso viene después de que un cliente chileno pague.”</w:t>
-      </w:r>
-      <w:r>
-        <w:t xml:space="preserve"> </w:t>
-      </w:r>
-      <w:r>
-        <w:t xml:space="preserve">Y vuelves.</w:t>
-      </w:r>
-    </w:p>
-    <w:p>
-      <w:pPr>
-        <w:pStyle w:val="Compact"/>
-        <w:numPr>
-          <w:ilvl w:val="0"/>
-          <w:numId w:val="1007"/>
-        </w:numPr>
-      </w:pPr>
-      <w:r>
-        <w:t xml:space="preserve">Arquitectura, modelos, dashboards de tokens, consola de ingesta.</w:t>
-      </w:r>
-    </w:p>
-    <w:p>
-      <w:pPr>
-        <w:pStyle w:val="Compact"/>
-        <w:numPr>
-          <w:ilvl w:val="0"/>
-          <w:numId w:val="1007"/>
-        </w:numPr>
-      </w:pPr>
-      <w:r>
-        <w:t xml:space="preserve">El corpus de otro cliente.</w:t>
-      </w:r>
-    </w:p>
-    <w:p>
-      <w:pPr>
-        <w:pStyle w:val="Compact"/>
-        <w:numPr>
-          <w:ilvl w:val="0"/>
-          <w:numId w:val="1007"/>
-        </w:numPr>
-      </w:pPr>
-      <w:r>
-        <w:t xml:space="preserve">“Socio”</w:t>
-      </w:r>
-      <w:r>
-        <w:t xml:space="preserve">, equity, exclusividad, comisión, sueldo. Si él los trae, escuchas, agradeces y difieres a después del piloto.</w:t>
-      </w:r>
-    </w:p>
-    <w:p>
-      <w:pPr>
-        <w:pStyle w:val="Compact"/>
-        <w:numPr>
-          <w:ilvl w:val="0"/>
-          <w:numId w:val="1007"/>
-        </w:numPr>
-      </w:pPr>
-      <w:r>
-        <w:t xml:space="preserve">Garantías absolutas de precisión.</w:t>
-      </w:r>
-    </w:p>
-    <w:p>
-      <w:pPr>
-        <w:pStyle w:val="Compact"/>
-        <w:numPr>
-          <w:ilvl w:val="0"/>
-          <w:numId w:val="1007"/>
-        </w:numPr>
-      </w:pPr>
-      <w:r>
-        <w:t xml:space="preserve">Fechas de entrega de la voz manos libres.</w:t>
-      </w:r>
-    </w:p>
-    <w:p>
-      <w:r>
-        <w:pict>
-          <v:rect style="width:0;height:1.5pt" o:hralign="center" o:hrstd="t" o:hr="t"/>
-        </w:pict>
-      </w:r>
-    </w:p>
-    <w:bookmarkEnd w:id="44"/>
-    <w:bookmarkStart w:id="46" w:name="cierre-y-seguimiento"/>
-    <w:p>
-      <w:pPr>
-        <w:pStyle w:val="Heading2"/>
-      </w:pPr>
-      <w:r>
-        <w:t xml:space="preserve">13. Cierre y seguimiento</w:t>
-      </w:r>
-    </w:p>
-    <w:p>
-      <w:pPr>
-        <w:pStyle w:val="FirstParagraph"/>
-      </w:pPr>
-      <w:r>
-        <w:t xml:space="preserve">Repetir en voz alta antes de despedirse, y enviar por escrito esa misma tarde:</w:t>
-      </w:r>
-    </w:p>
-    <w:p>
-      <w:pPr>
-        <w:pStyle w:val="BlockText"/>
-      </w:pPr>
-      <w:r>
-        <w:t xml:space="preserve">Gonzalo, gracias por hoy. Lo que acordamos: [Nombre] y [Nombre] prueban Danebo con los manuales de [marcas] en [caso] desde el [fecha]. Yo les mando acceso e instrucciones el [fecha]. Nos juntamos el [fecha] para revisar qué preguntaron, qué respondió y qué no sirvió. Si algo de esto no es así, corrígeme.</w:t>
-      </w:r>
-    </w:p>
-    <w:p>
-      <w:pPr>
-        <w:pStyle w:val="FirstParagraph"/>
-      </w:pPr>
-      <w:r>
-        <w:rPr>
-          <w:b/>
-          <w:bCs/>
-        </w:rPr>
-        <w:t xml:space="preserve">Responsables:</w:t>
-      </w:r>
-      <w:r>
-        <w:t xml:space="preserve"> </w:t>
-      </w:r>
-      <w:r>
-        <w:t xml:space="preserve">tú habilitas, instrumentas y mides. Él nombra y consigue que usen. Si lo segundo no ocurre, no hay piloto, y eso es un dato.</w:t>
-      </w:r>
-    </w:p>
-    <w:p>
-      <w:pPr>
-        <w:pStyle w:val="BodyText"/>
-      </w:pPr>
-      <w:r>
-        <w:rPr>
-          <w:b/>
-          <w:bCs/>
-        </w:rPr>
-        <w:t xml:space="preserve">Qué se registra en cada recorrido:</w:t>
-      </w:r>
-      <w:r>
-        <w:t xml:space="preserve"> </w:t>
-      </w:r>
-      <w:r>
-        <w:t xml:space="preserve">finalización, tiempo comparado con el método actual declarado por el usuario, correcciones, recuperación tras interrupción, pasos que exigieron ayuda, repetición voluntaria, costo y minutos, y qué parte del resultado usó o descartó.</w:t>
-      </w:r>
-    </w:p>
-    <w:bookmarkStart w:id="45" w:name="X1e802080ebb00b8649bd04af9d315f1d3f25871"/>
-    <w:p>
-      <w:pPr>
-        <w:pStyle w:val="Heading3"/>
-      </w:pPr>
-      <w:r>
-        <w:t xml:space="preserve">Alternativas de colaboración, por conveniencia</w:t>
       </w:r>
     </w:p>
     <w:p>
@@ -5702,17 +5818,7 @@
         </w:numPr>
       </w:pPr>
       <w:r>
-        <w:rPr>
-          <w:b/>
-          <w:bCs/>
-        </w:rPr>
-        <w:t xml:space="preserve">Colaboración por objetivo, sin estructura</w:t>
-      </w:r>
-      <w:r>
-        <w:t xml:space="preserve"> </w:t>
-      </w:r>
-      <w:r>
-        <w:t xml:space="preserve">(recomendada): nombra 1–2 usuarios y un caso; tú habilitas y devuelves resultado en fecha. Cero dinero, cero equity, cero exclusividad.</w:t>
+        <w:t xml:space="preserve">Precio propio, COGS, los US$255,21, el runway, cifras de caja.</w:t>
       </w:r>
     </w:p>
     <w:p>
@@ -5724,14 +5830,32 @@
         </w:numPr>
       </w:pPr>
       <w:r>
-        <w:rPr>
-          <w:b/>
-          <w:bCs/>
-        </w:rPr>
-        <w:t xml:space="preserve">Comisión sobre dinero cobrado</w:t>
-      </w:r>
-      <w:r>
-        <w:t xml:space="preserve">, solo si el piloto funciona y él produce una conversación con un decisor. Se conversa en octubre, por escrito, contra factura pagada.</w:t>
+        <w:t xml:space="preserve">CORFO. Si pregunta por fondos:</w:t>
+      </w:r>
+      <w:r>
+        <w:t xml:space="preserve"> </w:t>
+      </w:r>
+      <w:r>
+        <w:rPr>
+          <w:i/>
+          <w:iCs/>
+        </w:rPr>
+        <w:t xml:space="preserve">“Postulé a Start-Up Chile en mayo, no quedó. El feedback fue claro: faltaba validación comercial. Vuelvo a postular cuando tenga uso real y ojalá un cliente pagando.”</w:t>
+      </w:r>
+      <w:r>
+        <w:t xml:space="preserve"> </w:t>
+      </w:r>
+      <w:r>
+        <w:t xml:space="preserve">Sin montos, sin sueldos, sin</w:t>
+      </w:r>
+      <w:r>
+        <w:t xml:space="preserve"> </w:t>
+      </w:r>
+      <w:r>
+        <w:t xml:space="preserve">“si tú participas”</w:t>
+      </w:r>
+      <w:r>
+        <w:t xml:space="preserve">.</w:t>
       </w:r>
     </w:p>
     <w:p>
@@ -5743,22 +5867,86 @@
         </w:numPr>
       </w:pPr>
       <w:r>
-        <w:rPr>
-          <w:b/>
-          <w:bCs/>
-        </w:rPr>
-        <w:t xml:space="preserve">Asesoría recurrente o relación estructural</w:t>
-      </w:r>
-      <w:r>
-        <w:t xml:space="preserve">, solo después de aporte repetido y verificable, con abogado. No se menciona salvo que él la proponga.</w:t>
-      </w:r>
-    </w:p>
-    <w:p>
-      <w:pPr>
-        <w:pStyle w:val="FirstParagraph"/>
-      </w:pPr>
-      <w:r>
-        <w:t xml:space="preserve">No se ofrece mentoría pagada: en la demo la declinó.</w:t>
+        <w:t xml:space="preserve">Expansión regional. Si pregunta por crecimiento:</w:t>
+      </w:r>
+      <w:r>
+        <w:t xml:space="preserve"> </w:t>
+      </w:r>
+      <w:r>
+        <w:rPr>
+          <w:i/>
+          <w:iCs/>
+        </w:rPr>
+        <w:t xml:space="preserve">“Chile primero, con ascensores. El motor de dictar, confirmar y dejar un informe trazable sirve para otros servicios regulados de terreno, pero eso viene después de que un cliente chileno pague.”</w:t>
+      </w:r>
+      <w:r>
+        <w:t xml:space="preserve"> </w:t>
+      </w:r>
+      <w:r>
+        <w:t xml:space="preserve">Y vuelves.</w:t>
+      </w:r>
+    </w:p>
+    <w:p>
+      <w:pPr>
+        <w:pStyle w:val="Compact"/>
+        <w:numPr>
+          <w:ilvl w:val="0"/>
+          <w:numId w:val="1008"/>
+        </w:numPr>
+      </w:pPr>
+      <w:r>
+        <w:t xml:space="preserve">Arquitectura, modelos, dashboards de tokens, consola de ingesta.</w:t>
+      </w:r>
+    </w:p>
+    <w:p>
+      <w:pPr>
+        <w:pStyle w:val="Compact"/>
+        <w:numPr>
+          <w:ilvl w:val="0"/>
+          <w:numId w:val="1008"/>
+        </w:numPr>
+      </w:pPr>
+      <w:r>
+        <w:t xml:space="preserve">El corpus de otro cliente.</w:t>
+      </w:r>
+    </w:p>
+    <w:p>
+      <w:pPr>
+        <w:pStyle w:val="Compact"/>
+        <w:numPr>
+          <w:ilvl w:val="0"/>
+          <w:numId w:val="1008"/>
+        </w:numPr>
+      </w:pPr>
+      <w:r>
+        <w:t xml:space="preserve">“Socio”</w:t>
+      </w:r>
+      <w:r>
+        <w:t xml:space="preserve">, equity, exclusividad, comisión, sueldo. Si él los trae, escuchas, agradeces y difieres a después del piloto.</w:t>
+      </w:r>
+    </w:p>
+    <w:p>
+      <w:pPr>
+        <w:pStyle w:val="Compact"/>
+        <w:numPr>
+          <w:ilvl w:val="0"/>
+          <w:numId w:val="1008"/>
+        </w:numPr>
+      </w:pPr>
+      <w:r>
+        <w:t xml:space="preserve">Garantías absolutas de precisión.</w:t>
+      </w:r>
+    </w:p>
+    <w:p>
+      <w:pPr>
+        <w:pStyle w:val="Compact"/>
+        <w:numPr>
+          <w:ilvl w:val="0"/>
+          <w:numId w:val="1008"/>
+        </w:numPr>
+      </w:pPr>
+      <w:r>
+        <w:t xml:space="preserve">Fechas de entrega de la voz manos libres.</w:t>
       </w:r>
     </w:p>
     <w:p>
@@ -5769,14 +5957,74 @@
       </w:r>
     </w:p>
     <w:bookmarkEnd w:id="45"/>
-    <w:bookmarkEnd w:id="46"/>
-    <w:bookmarkStart w:id="47" w:name="señales-para-pausar"/>
+    <w:bookmarkStart w:id="47" w:name="cierre-y-seguimiento"/>
     <w:p>
       <w:pPr>
         <w:pStyle w:val="Heading2"/>
       </w:pPr>
       <w:r>
-        <w:t xml:space="preserve">14. Señales para pausar</w:t>
+        <w:t xml:space="preserve">13. Cierre y seguimiento</w:t>
+      </w:r>
+    </w:p>
+    <w:p>
+      <w:pPr>
+        <w:pStyle w:val="FirstParagraph"/>
+      </w:pPr>
+      <w:r>
+        <w:t xml:space="preserve">Repetir en voz alta antes de despedirse, y enviar por escrito esa misma tarde:</w:t>
+      </w:r>
+    </w:p>
+    <w:p>
+      <w:pPr>
+        <w:pStyle w:val="BlockText"/>
+      </w:pPr>
+      <w:r>
+        <w:t xml:space="preserve">Gonzalo, gracias por hoy. Lo que acordamos: [Nombre] y [Nombre] prueban Danebo con los manuales de [marcas] en [caso] desde el [fecha]. Yo les mando acceso e instrucciones el [fecha]. Nos juntamos el [fecha] para revisar qué preguntaron, qué respondió y qué no sirvió. Si algo de esto no es así, corrígeme.</w:t>
+      </w:r>
+    </w:p>
+    <w:p>
+      <w:pPr>
+        <w:pStyle w:val="FirstParagraph"/>
+      </w:pPr>
+      <w:r>
+        <w:rPr>
+          <w:b/>
+          <w:bCs/>
+        </w:rPr>
+        <w:t xml:space="preserve">Responsables:</w:t>
+      </w:r>
+      <w:r>
+        <w:t xml:space="preserve"> </w:t>
+      </w:r>
+      <w:r>
+        <w:t xml:space="preserve">tú habilitas, instrumentas y mides. Él nombra y consigue que usen. Si lo segundo no ocurre, no hay piloto, y eso es un dato.</w:t>
+      </w:r>
+    </w:p>
+    <w:p>
+      <w:pPr>
+        <w:pStyle w:val="BodyText"/>
+      </w:pPr>
+      <w:r>
+        <w:rPr>
+          <w:b/>
+          <w:bCs/>
+        </w:rPr>
+        <w:t xml:space="preserve">Qué se registra en cada recorrido:</w:t>
+      </w:r>
+      <w:r>
+        <w:t xml:space="preserve"> </w:t>
+      </w:r>
+      <w:r>
+        <w:t xml:space="preserve">finalización, tiempo comparado con el método actual declarado por el usuario, correcciones, recuperación tras interrupción, pasos que exigieron ayuda, repetición voluntaria, costo y minutos, y qué parte del resultado usó o descartó.</w:t>
+      </w:r>
+    </w:p>
+    <w:bookmarkStart w:id="46" w:name="X1e802080ebb00b8649bd04af9d315f1d3f25871"/>
+    <w:p>
+      <w:pPr>
+        <w:pStyle w:val="Heading3"/>
+      </w:pPr>
+      <w:r>
+        <w:t xml:space="preserve">Alternativas de colaboración, por conveniencia</w:t>
       </w:r>
     </w:p>
     <w:p>
@@ -5788,7 +6036,17 @@
         </w:numPr>
       </w:pPr>
       <w:r>
-        <w:t xml:space="preserve">No puede nombrar a nadie ni dar fecha para nombrarlo.</w:t>
+        <w:rPr>
+          <w:b/>
+          <w:bCs/>
+        </w:rPr>
+        <w:t xml:space="preserve">Colaboración por objetivo, sin estructura</w:t>
+      </w:r>
+      <w:r>
+        <w:t xml:space="preserve"> </w:t>
+      </w:r>
+      <w:r>
+        <w:t xml:space="preserve">(recomendada): nombra 1–2 usuarios y un caso; tú habilitas y devuelves resultado en fecha. Cero dinero, cero equity, cero exclusividad.</w:t>
       </w:r>
     </w:p>
     <w:p>
@@ -5800,7 +6058,14 @@
         </w:numPr>
       </w:pPr>
       <w:r>
-        <w:t xml:space="preserve">Los usuarios nombrados no entran en la semana acordada y no responde a un recordatorio.</w:t>
+        <w:rPr>
+          <w:b/>
+          <w:bCs/>
+        </w:rPr>
+        <w:t xml:space="preserve">Comisión sobre dinero cobrado</w:t>
+      </w:r>
+      <w:r>
+        <w:t xml:space="preserve">, solo si el piloto funciona y él produce una conversación con un decisor. Se conversa en octubre, por escrito, contra factura pagada.</w:t>
       </w:r>
     </w:p>
     <w:p>
@@ -5812,43 +6077,14 @@
         </w:numPr>
       </w:pPr>
       <w:r>
-        <w:t xml:space="preserve">Habla de estructura, porcentaje o exclusividad antes de que nadie haya usado la app.</w:t>
-      </w:r>
-    </w:p>
-    <w:p>
-      <w:pPr>
-        <w:pStyle w:val="Compact"/>
-        <w:numPr>
-          <w:ilvl w:val="0"/>
-          <w:numId w:val="1009"/>
-        </w:numPr>
-      </w:pPr>
-      <w:r>
-        <w:t xml:space="preserve">Pide más manuales cargados como condición previa a que alguien pruebe.</w:t>
-      </w:r>
-    </w:p>
-    <w:p>
-      <w:pPr>
-        <w:pStyle w:val="Compact"/>
-        <w:numPr>
-          <w:ilvl w:val="0"/>
-          <w:numId w:val="1009"/>
-        </w:numPr>
-      </w:pPr>
-      <w:r>
-        <w:t xml:space="preserve">Aparece un conflicto con su empleador que no puede resolver.</w:t>
-      </w:r>
-    </w:p>
-    <w:p>
-      <w:pPr>
-        <w:pStyle w:val="Compact"/>
-        <w:numPr>
-          <w:ilvl w:val="0"/>
-          <w:numId w:val="1009"/>
-        </w:numPr>
-      </w:pPr>
-      <w:r>
-        <w:t xml:space="preserve">Pide costos con insistencia sin aportar datos de mercado.</w:t>
+        <w:rPr>
+          <w:b/>
+          <w:bCs/>
+        </w:rPr>
+        <w:t xml:space="preserve">Asesoría recurrente o relación estructural</w:t>
+      </w:r>
+      <w:r>
+        <w:t xml:space="preserve">, solo después de aporte repetido y verificable, con abogado. No se menciona salvo que él la proponga.</w:t>
       </w:r>
     </w:p>
     <w:p>
@@ -5856,25 +6092,7 @@
         <w:pStyle w:val="FirstParagraph"/>
       </w:pPr>
       <w:r>
-        <w:t xml:space="preserve">Con dos de estas: escenario C. Se resuelve por escrito la custodia del corpus y se sigue con Carlos, Venezuela y el registro MINVU. Sin drama y sin cerrar la puerta.</w:t>
-      </w:r>
-    </w:p>
-    <w:p>
-      <w:pPr>
-        <w:pStyle w:val="BodyText"/>
-      </w:pPr>
-      <w:r>
-        <w:rPr>
-          <w:b/>
-          <w:bCs/>
-        </w:rPr>
-        <w:t xml:space="preserve">Regla de cierre del Plan General, que no cambia por esta reunión:</w:t>
-      </w:r>
-      <w:r>
-        <w:t xml:space="preserve"> </w:t>
-      </w:r>
-      <w:r>
-        <w:t xml:space="preserve">ninguna decisión de producto, gasto, postulación, venta o fecha depende de Gonzalo. Los gates del 16 de septiembre, 2 de octubre y 2 de noviembre no se mueven por lo que pase el viernes.</w:t>
+        <w:t xml:space="preserve">No se ofrece mentoría pagada: en la demo la declinó.</w:t>
       </w:r>
     </w:p>
     <w:p>
@@ -5884,789 +6102,15 @@
         </w:pict>
       </w:r>
     </w:p>
+    <w:bookmarkEnd w:id="46"/>
     <w:bookmarkEnd w:id="47"/>
-    <w:bookmarkStart w:id="48" w:name="hoja-de-bolsillo"/>
+    <w:bookmarkStart w:id="48" w:name="señales-para-pausar"/>
     <w:p>
       <w:pPr>
         <w:pStyle w:val="Heading2"/>
       </w:pPr>
       <w:r>
-        <w:t xml:space="preserve">15. Hoja de bolsillo</w:t>
-      </w:r>
-    </w:p>
-    <w:p>
-      <w:pPr>
-        <w:pStyle w:val="SourceCode"/>
-      </w:pPr>
-      <w:r>
-        <w:rPr>
-          <w:rStyle w:val="VerbatimChar"/>
-        </w:rPr>
-        <w:t xml:space="preserve">OBJETIVO ÚNICO: nombre + caso + fecha inicio + fecha revisión.</w:t>
-      </w:r>
-      <w:r>
-        <w:br/>
-      </w:r>
-      <w:r>
-        <w:rPr>
-          <w:rStyle w:val="VerbatimChar"/>
-        </w:rPr>
-        <w:t xml:space="preserve">Sin eso no cerró. Todo lo demás es información.</w:t>
-      </w:r>
-      <w:r>
-        <w:br/>
-      </w:r>
-      <w:r>
-        <w:br/>
-      </w:r>
-      <w:r>
-        <w:rPr>
-          <w:rStyle w:val="VerbatimChar"/>
-        </w:rPr>
-        <w:t xml:space="preserve">APERTURA (su idea, con atribución)</w:t>
-      </w:r>
-      <w:r>
-        <w:br/>
-      </w:r>
-      <w:r>
-        <w:rPr>
-          <w:rStyle w:val="VerbatimChar"/>
-        </w:rPr>
-        <w:t xml:space="preserve">"Me dijiste que lo valioso no era consultar el manual, sino que el</w:t>
-      </w:r>
-      <w:r>
-        <w:br/>
-      </w:r>
-      <w:r>
-        <w:rPr>
-          <w:rStyle w:val="VerbatimChar"/>
-        </w:rPr>
-        <w:t xml:space="preserve"> historial de fallas por marca quedara en la empresa y no en el</w:t>
-      </w:r>
-      <w:r>
-        <w:br/>
-      </w:r>
-      <w:r>
-        <w:rPr>
-          <w:rStyle w:val="VerbatimChar"/>
-        </w:rPr>
-        <w:t xml:space="preserve"> técnico, y que hubiera una base multimarca. Con tus manuales eso</w:t>
-      </w:r>
-      <w:r>
-        <w:br/>
-      </w:r>
-      <w:r>
-        <w:rPr>
-          <w:rStyle w:val="VerbatimChar"/>
-        </w:rPr>
-        <w:t xml:space="preserve"> es lo que hay hoy. Quiero mostrártelo y saber si sigues pensando</w:t>
-      </w:r>
-      <w:r>
-        <w:br/>
-      </w:r>
-      <w:r>
-        <w:rPr>
-          <w:rStyle w:val="VerbatimChar"/>
-        </w:rPr>
-        <w:t xml:space="preserve"> lo mismo."</w:t>
-      </w:r>
-      <w:r>
-        <w:br/>
-      </w:r>
-      <w:r>
-        <w:br/>
-      </w:r>
-      <w:r>
-        <w:rPr>
-          <w:rStyle w:val="VerbatimChar"/>
-        </w:rPr>
-        <w:t xml:space="preserve">DEMO 15 min, teléfono</w:t>
-      </w:r>
-      <w:r>
-        <w:br/>
-      </w:r>
-      <w:r>
-        <w:rPr>
-          <w:rStyle w:val="VerbatimChar"/>
-        </w:rPr>
-        <w:t xml:space="preserve"> Biblioteca (180 docs, 6 marcas) -&gt; él elige marca y pregunta x3</w:t>
-      </w:r>
-      <w:r>
-        <w:br/>
-      </w:r>
-      <w:r>
-        <w:rPr>
-          <w:rStyle w:val="VerbatimChar"/>
-        </w:rPr>
-        <w:t xml:space="preserve"> -&gt; foto de consola/tarjeta/plano (NO componente quemado)</w:t>
-      </w:r>
-      <w:r>
-        <w:br/>
-      </w:r>
-      <w:r>
-        <w:rPr>
-          <w:rStyle w:val="VerbatimChar"/>
-        </w:rPr>
-        <w:t xml:space="preserve"> -&gt; Schindler/Fermator: declara sin evidencia</w:t>
-      </w:r>
-      <w:r>
-        <w:br/>
-      </w:r>
-      <w:r>
-        <w:rPr>
-          <w:rStyle w:val="VerbatimChar"/>
-        </w:rPr>
-        <w:t xml:space="preserve"> -&gt; traza de sesión -&gt; cupo por usuario (NUNCA en pesos)</w:t>
-      </w:r>
-      <w:r>
-        <w:br/>
-      </w:r>
-      <w:r>
-        <w:rPr>
-          <w:rStyle w:val="VerbatimChar"/>
-        </w:rPr>
-        <w:t xml:space="preserve"> Decir yo primero: "esto no reemplaza el tester; el código puede</w:t>
-      </w:r>
-      <w:r>
-        <w:br/>
-      </w:r>
-      <w:r>
-        <w:rPr>
-          <w:rStyle w:val="VerbatimChar"/>
-        </w:rPr>
-        <w:t xml:space="preserve"> decir puertas y ser el variador."</w:t>
-      </w:r>
-      <w:r>
-        <w:br/>
-      </w:r>
-      <w:r>
-        <w:br/>
-      </w:r>
-      <w:r>
-        <w:rPr>
-          <w:rStyle w:val="VerbatimChar"/>
-        </w:rPr>
-        <w:t xml:space="preserve">OBJECIONES -&gt; RESPUESTA</w:t>
-      </w:r>
-      <w:r>
-        <w:br/>
-      </w:r>
-      <w:r>
-        <w:rPr>
-          <w:rStyle w:val="VerbatimChar"/>
-        </w:rPr>
-        <w:t xml:space="preserve"> "el código miente"         -&gt; cierto; el diagnóstico es del técnico</w:t>
-      </w:r>
-      <w:r>
-        <w:br/>
-      </w:r>
-      <w:r>
-        <w:rPr>
-          <w:rStyle w:val="VerbatimChar"/>
-        </w:rPr>
-        <w:t xml:space="preserve"> "es la mitad de la pega"   -&gt; la mitad que hoy hace ing. de campo</w:t>
-      </w:r>
-      <w:r>
-        <w:br/>
-      </w:r>
-      <w:r>
-        <w:rPr>
-          <w:rStyle w:val="VerbatimChar"/>
-        </w:rPr>
-        <w:t xml:space="preserve"> "el quemado ya es la falla"-&gt; no uso esa foto</w:t>
-      </w:r>
-      <w:r>
-        <w:br/>
-      </w:r>
-      <w:r>
-        <w:rPr>
-          <w:rStyle w:val="VerbatimChar"/>
-        </w:rPr>
-        <w:t xml:space="preserve"> "ya tengo control+F"       -&gt; la carpeta la tienes tú, no el técnico</w:t>
-      </w:r>
-      <w:r>
-        <w:br/>
-      </w:r>
-      <w:r>
-        <w:rPr>
-          <w:rStyle w:val="VerbatimChar"/>
-        </w:rPr>
-        <w:t xml:space="preserve">                               en el foso; y son 6 marcas a la vez</w:t>
-      </w:r>
-      <w:r>
-        <w:br/>
-      </w:r>
-      <w:r>
-        <w:rPr>
-          <w:rStyle w:val="VerbatimChar"/>
-        </w:rPr>
-        <w:t xml:space="preserve"> "falsa confianza"          -&gt; cita página y declara los vacíos</w:t>
-      </w:r>
-      <w:r>
-        <w:br/>
-      </w:r>
-      <w:r>
-        <w:br/>
-      </w:r>
-      <w:r>
-        <w:rPr>
-          <w:rStyle w:val="VerbatimChar"/>
-        </w:rPr>
-        <w:t xml:space="preserve">CHATGPT (6)</w:t>
-      </w:r>
-      <w:r>
-        <w:br/>
-      </w:r>
-      <w:r>
-        <w:rPr>
-          <w:rStyle w:val="VerbatimChar"/>
-        </w:rPr>
-        <w:t xml:space="preserve"> 1 multicuenta/aislamiento  2 si no está lo dice + cita página</w:t>
-      </w:r>
-      <w:r>
-        <w:br/>
-      </w:r>
-      <w:r>
-        <w:rPr>
-          <w:rStyle w:val="VerbatimChar"/>
-        </w:rPr>
-        <w:t xml:space="preserve"> 3 traza auditable por técnico  4 calibra con uso real</w:t>
-      </w:r>
-      <w:r>
-        <w:br/>
-      </w:r>
-      <w:r>
-        <w:rPr>
-          <w:rStyle w:val="VerbatimChar"/>
-        </w:rPr>
-        <w:t xml:space="preserve"> 5 contexto acotado  6 cupo visible (sin pesos)</w:t>
-      </w:r>
-      <w:r>
-        <w:br/>
-      </w:r>
-      <w:r>
-        <w:rPr>
-          <w:rStyle w:val="VerbatimChar"/>
-        </w:rPr>
-        <w:t xml:space="preserve"> Cierre: "pruébalo con una pregunta difícil, ahora"</w:t>
-      </w:r>
-      <w:r>
-        <w:br/>
-      </w:r>
-      <w:r>
-        <w:rPr>
-          <w:rStyle w:val="VerbatimChar"/>
-        </w:rPr>
-        <w:t xml:space="preserve"> Prohibido: "garantizo la precisión", "no alucina"</w:t>
-      </w:r>
-      <w:r>
-        <w:br/>
-      </w:r>
-      <w:r>
-        <w:br/>
-      </w:r>
-      <w:r>
-        <w:rPr>
-          <w:rStyle w:val="VerbatimChar"/>
-        </w:rPr>
-        <w:t xml:space="preserve">PREGUNTAS (1,2,4,5,8 obligatorias)</w:t>
-      </w:r>
-      <w:r>
-        <w:br/>
-      </w:r>
-      <w:r>
-        <w:rPr>
-          <w:rStyle w:val="VerbatimChar"/>
-        </w:rPr>
-        <w:t xml:space="preserve"> 1 ¿Qué esperabas ver hoy? ¿Qué te haría decir sirve / no sirve?</w:t>
-      </w:r>
-      <w:r>
-        <w:br/>
-      </w:r>
-      <w:r>
-        <w:rPr>
-          <w:rStyle w:val="VerbatimChar"/>
-        </w:rPr>
-        <w:t xml:space="preserve"> 2 Escalada a ingeniería de campo: ¿cuántas/semana, quién?</w:t>
-      </w:r>
-      <w:r>
-        <w:br/>
-      </w:r>
-      <w:r>
-        <w:rPr>
-          <w:rStyle w:val="VerbatimChar"/>
-        </w:rPr>
-        <w:t xml:space="preserve"> 3 Cartera que rechazan por marca desconocida: ¿cuánta, qué falta?</w:t>
-      </w:r>
-      <w:r>
-        <w:br/>
-      </w:r>
-      <w:r>
-        <w:rPr>
-          <w:rStyle w:val="VerbatimChar"/>
-        </w:rPr>
-        <w:t xml:space="preserve"> 4 ¿Cómo te imaginas participando? ¿tiempo real en 30 días?</w:t>
-      </w:r>
-      <w:r>
-        <w:br/>
-      </w:r>
-      <w:r>
-        <w:rPr>
-          <w:rStyle w:val="VerbatimChar"/>
-        </w:rPr>
-        <w:t xml:space="preserve"> 5 ¿Vender a otras mantenedoras te complica con tu empresa?</w:t>
-      </w:r>
-      <w:r>
-        <w:br/>
-      </w:r>
-      <w:r>
-        <w:rPr>
-          <w:rStyle w:val="VerbatimChar"/>
-        </w:rPr>
-        <w:t xml:space="preserve"> 6 ¿Quién decide software y hasta qué monto sin comité?</w:t>
-      </w:r>
-      <w:r>
-        <w:br/>
-      </w:r>
-      <w:r>
-        <w:rPr>
-          <w:rStyle w:val="VerbatimChar"/>
-        </w:rPr>
-        <w:t xml:space="preserve"> 7 ¿% mantención vs correctivos/modernizaciones?</w:t>
-      </w:r>
-      <w:r>
-        <w:br/>
-      </w:r>
-      <w:r>
-        <w:rPr>
-          <w:rStyle w:val="VerbatimChar"/>
-        </w:rPr>
-        <w:t xml:space="preserve"> 8 CIERRE: 1-2 ingenieros, 2 semanas: ¿quiénes, qué caso, cuándo?</w:t>
-      </w:r>
-      <w:r>
-        <w:br/>
-      </w:r>
-      <w:r>
-        <w:rPr>
-          <w:rStyle w:val="VerbatimChar"/>
-        </w:rPr>
-        <w:t xml:space="preserve"> (certificador) Cuando hacías los informes tú mismo, ¿cuánto se</w:t>
-      </w:r>
-      <w:r>
-        <w:br/>
-      </w:r>
-      <w:r>
-        <w:rPr>
-          <w:rStyle w:val="VerbatimChar"/>
-        </w:rPr>
-        <w:t xml:space="preserve">  te iba escribiéndolos después de la visita?</w:t>
-      </w:r>
-      <w:r>
-        <w:br/>
-      </w:r>
-      <w:r>
-        <w:br/>
-      </w:r>
-      <w:r>
-        <w:rPr>
-          <w:rStyle w:val="VerbatimChar"/>
-        </w:rPr>
-        <w:t xml:space="preserve">CORPUS (sin monto)</w:t>
-      </w:r>
-      <w:r>
-        <w:br/>
-      </w:r>
-      <w:r>
-        <w:rPr>
-          <w:rStyle w:val="VerbatimChar"/>
-        </w:rPr>
-        <w:t xml:space="preserve"> "Es lo más valioso que he recibido. Sin eso no tendría con qué</w:t>
-      </w:r>
-      <w:r>
-        <w:br/>
-      </w:r>
-      <w:r>
-        <w:rPr>
-          <w:rStyle w:val="VerbatimChar"/>
-        </w:rPr>
-        <w:t xml:space="preserve">  probar nada real. Están aislados y no los he usado con nadie.</w:t>
-      </w:r>
-      <w:r>
-        <w:br/>
-      </w:r>
-      <w:r>
-        <w:rPr>
-          <w:rStyle w:val="VerbatimChar"/>
-        </w:rPr>
-        <w:t xml:space="preserve">  ¿Se quedan solo ahí o pueden ser base para otros clientes?</w:t>
-      </w:r>
-      <w:r>
-        <w:br/>
-      </w:r>
-      <w:r>
-        <w:rPr>
-          <w:rStyle w:val="VerbatimChar"/>
-        </w:rPr>
-        <w:t xml:space="preserve">  Y si fuera lo segundo, ¿qué te gustaría a cambio?"</w:t>
-      </w:r>
-      <w:r>
-        <w:br/>
-      </w:r>
-      <w:r>
-        <w:rPr>
-          <w:rStyle w:val="VerbatimChar"/>
-        </w:rPr>
-        <w:t xml:space="preserve"> Si pregunta por qué no cargué todo: 6 marcas acordadas ~10 mil</w:t>
-      </w:r>
-      <w:r>
-        <w:br/>
-      </w:r>
-      <w:r>
-        <w:rPr>
-          <w:rStyle w:val="VerbatimChar"/>
-        </w:rPr>
-        <w:t xml:space="preserve"> págs; quedan ~15 mil. Cuesta por página y no quise pasarme de</w:t>
-      </w:r>
-      <w:r>
-        <w:br/>
-      </w:r>
-      <w:r>
-        <w:rPr>
-          <w:rStyle w:val="VerbatimChar"/>
-        </w:rPr>
-        <w:t xml:space="preserve"> lo acordado. Sin dólares, sin reclamo.</w:t>
-      </w:r>
-      <w:r>
-        <w:br/>
-      </w:r>
-      <w:r>
-        <w:br/>
-      </w:r>
-      <w:r>
-        <w:rPr>
-          <w:rStyle w:val="VerbatimChar"/>
-        </w:rPr>
-        <w:t xml:space="preserve">ACTIVACIÓN (sin número)</w:t>
-      </w:r>
-      <w:r>
-        <w:br/>
-      </w:r>
-      <w:r>
-        <w:rPr>
-          <w:rStyle w:val="VerbatimChar"/>
-        </w:rPr>
-        <w:t xml:space="preserve"> "No es solo cargar manuales: usuarios por técnico, biblioteca</w:t>
-      </w:r>
-      <w:r>
-        <w:br/>
-      </w:r>
-      <w:r>
-        <w:rPr>
-          <w:rStyle w:val="VerbatimChar"/>
-        </w:rPr>
-        <w:t xml:space="preserve">  aislada, y si quieres su propio dominio. Ya tengo un cliente</w:t>
-      </w:r>
-      <w:r>
-        <w:br/>
-      </w:r>
-      <w:r>
-        <w:rPr>
-          <w:rStyle w:val="VerbatimChar"/>
-        </w:rPr>
-        <w:t xml:space="preserve">  así. Se cobra aparte porque es trabajo por empresa."</w:t>
-      </w:r>
-      <w:r>
-        <w:br/>
-      </w:r>
-      <w:r>
-        <w:br/>
-      </w:r>
-      <w:r>
-        <w:rPr>
-          <w:rStyle w:val="VerbatimChar"/>
-        </w:rPr>
-        <w:t xml:space="preserve">SI PREGUNTA PRECIO / MODELO</w:t>
-      </w:r>
-      <w:r>
-        <w:br/>
-      </w:r>
-      <w:r>
-        <w:rPr>
-          <w:rStyle w:val="VerbatimChar"/>
-        </w:rPr>
-        <w:t xml:space="preserve"> 1 "Tres formas: por técnico, por equipo, por informe. ¿Cuál</w:t>
-      </w:r>
-      <w:r>
-        <w:br/>
-      </w:r>
-      <w:r>
-        <w:rPr>
-          <w:rStyle w:val="VerbatimChar"/>
-        </w:rPr>
-        <w:t xml:space="preserve">    acepta una mantenedora y en qué rango?"</w:t>
-      </w:r>
-      <w:r>
-        <w:br/>
-      </w:r>
-      <w:r>
-        <w:rPr>
-          <w:rStyle w:val="VerbatimChar"/>
-        </w:rPr>
-        <w:t xml:space="preserve"> 2 "No está decidido: estoy midiendo el costo, falta el de la voz."</w:t>
-      </w:r>
-      <w:r>
-        <w:br/>
-      </w:r>
-      <w:r>
-        <w:rPr>
-          <w:rStyle w:val="VerbatimChar"/>
-        </w:rPr>
-        <w:t xml:space="preserve"> 3 "Te lo digo en octubre, con el piloto encima."</w:t>
-      </w:r>
-      <w:r>
-        <w:br/>
-      </w:r>
-      <w:r>
-        <w:rPr>
-          <w:rStyle w:val="VerbatimChar"/>
-        </w:rPr>
-        <w:t xml:space="preserve"> Puente: "el modelo lo define el piloto. Armemos la prueba."</w:t>
-      </w:r>
-      <w:r>
-        <w:br/>
-      </w:r>
-      <w:r>
-        <w:br/>
-      </w:r>
-      <w:r>
-        <w:rPr>
-          <w:rStyle w:val="VerbatimChar"/>
-        </w:rPr>
-        <w:t xml:space="preserve">VISIÓN (solo min 42-45, después del cierre)</w:t>
-      </w:r>
-      <w:r>
-        <w:br/>
-      </w:r>
-      <w:r>
-        <w:rPr>
-          <w:rStyle w:val="VerbatimChar"/>
-        </w:rPr>
-        <w:t xml:space="preserve"> "Que el técnico deje el teléfono en el piso, pregunte hablando y</w:t>
-      </w:r>
-      <w:r>
-        <w:br/>
-      </w:r>
-      <w:r>
-        <w:rPr>
-          <w:rStyle w:val="VerbatimChar"/>
-        </w:rPr>
-        <w:t xml:space="preserve">  la aplicación le conteste hablando y lo vaya guiando. Con</w:t>
-      </w:r>
-      <w:r>
-        <w:br/>
-      </w:r>
-      <w:r>
-        <w:rPr>
-          <w:rStyle w:val="VerbatimChar"/>
-        </w:rPr>
-        <w:t xml:space="preserve">  guantes, poca luz, sin soltar la herramienta. Es hacia donde</w:t>
-      </w:r>
-      <w:r>
-        <w:br/>
-      </w:r>
-      <w:r>
-        <w:rPr>
-          <w:rStyle w:val="VerbatimChar"/>
-        </w:rPr>
-        <w:t xml:space="preserve">  va Danebo."</w:t>
-      </w:r>
-      <w:r>
-        <w:br/>
-      </w:r>
-      <w:r>
-        <w:rPr>
-          <w:rStyle w:val="VerbatimChar"/>
-        </w:rPr>
-        <w:t xml:space="preserve"> "Lo que me tiene indeciso es cuál de los tres módulos construyo</w:t>
-      </w:r>
-      <w:r>
-        <w:br/>
-      </w:r>
-      <w:r>
-        <w:rPr>
-          <w:rStyle w:val="VerbatimChar"/>
-        </w:rPr>
-        <w:t xml:space="preserve">  primero. El piloto me lo dice."</w:t>
-      </w:r>
-      <w:r>
-        <w:br/>
-      </w:r>
-      <w:r>
-        <w:rPr>
-          <w:rStyle w:val="VerbatimChar"/>
-        </w:rPr>
-        <w:t xml:space="preserve"> El piloto se hace con lo que existe hoy; la voz no es parte de él.</w:t>
-      </w:r>
-      <w:r>
-        <w:br/>
-      </w:r>
-      <w:r>
-        <w:rPr>
-          <w:rStyle w:val="VerbatimChar"/>
-        </w:rPr>
-        <w:t xml:space="preserve"> Voz del certificador: mostrarla solo si pasó 5 recorridos limpios.</w:t>
-      </w:r>
-      <w:r>
-        <w:br/>
-      </w:r>
-      <w:r>
-        <w:rPr>
-          <w:rStyle w:val="VerbatimChar"/>
-        </w:rPr>
-        <w:t xml:space="preserve"> Es rumbo, no oferta. NO prometer fechas ni alcance.</w:t>
-      </w:r>
-      <w:r>
-        <w:br/>
-      </w:r>
-      <w:r>
-        <w:br/>
-      </w:r>
-      <w:r>
-        <w:rPr>
-          <w:rStyle w:val="VerbatimChar"/>
-        </w:rPr>
-        <w:t xml:space="preserve">NO DECIR</w:t>
-      </w:r>
-      <w:r>
-        <w:br/>
-      </w:r>
-      <w:r>
-        <w:rPr>
-          <w:rStyle w:val="VerbatimChar"/>
-        </w:rPr>
-        <w:t xml:space="preserve"> Precio, COGS, US$255, runway, CORFO, expansión regional,</w:t>
-      </w:r>
-      <w:r>
-        <w:br/>
-      </w:r>
-      <w:r>
-        <w:rPr>
-          <w:rStyle w:val="VerbatimChar"/>
-        </w:rPr>
-        <w:t xml:space="preserve"> socio, equity, comisión, exclusividad, garantías absolutas.</w:t>
-      </w:r>
-      <w:r>
-        <w:br/>
-      </w:r>
-      <w:r>
-        <w:br/>
-      </w:r>
-      <w:r>
-        <w:rPr>
-          <w:rStyle w:val="VerbatimChar"/>
-        </w:rPr>
-        <w:t xml:space="preserve">CIERRE (en voz alta + escrito esa tarde)</w:t>
-      </w:r>
-      <w:r>
-        <w:br/>
-      </w:r>
-      <w:r>
-        <w:rPr>
-          <w:rStyle w:val="VerbatimChar"/>
-        </w:rPr>
-        <w:t xml:space="preserve"> Usuarios ______   Caso ______</w:t>
-      </w:r>
-      <w:r>
-        <w:br/>
-      </w:r>
-      <w:r>
-        <w:rPr>
-          <w:rStyle w:val="VerbatimChar"/>
-        </w:rPr>
-        <w:t xml:space="preserve"> Inicio ____  Revisión ____ (evitar 17-21 sep)</w:t>
-      </w:r>
-      <w:r>
-        <w:br/>
-      </w:r>
-      <w:r>
-        <w:rPr>
-          <w:rStyle w:val="VerbatimChar"/>
-        </w:rPr>
-        <w:t xml:space="preserve"> Yo: acceso e instrucciones el ____.  Él: que usen.</w:t>
-      </w:r>
-      <w:r>
-        <w:br/>
-      </w:r>
-      <w:r>
-        <w:rPr>
-          <w:rStyle w:val="VerbatimChar"/>
-        </w:rPr>
-        <w:t xml:space="preserve"> Éxito: 1 persona, 2 sesiones reales, sin mi ayuda, y me dice</w:t>
-      </w:r>
-      <w:r>
-        <w:br/>
-      </w:r>
-      <w:r>
-        <w:rPr>
-          <w:rStyle w:val="VerbatimChar"/>
-        </w:rPr>
-        <w:t xml:space="preserve"> una consulta que sirvió y una que falló.</w:t>
-      </w:r>
-      <w:r>
-        <w:br/>
-      </w:r>
-      <w:r>
-        <w:br/>
-      </w:r>
-      <w:r>
-        <w:rPr>
-          <w:rStyle w:val="VerbatimChar"/>
-        </w:rPr>
-        <w:t xml:space="preserve">PAUSA SI</w:t>
-      </w:r>
-      <w:r>
-        <w:br/>
-      </w:r>
-      <w:r>
-        <w:rPr>
-          <w:rStyle w:val="VerbatimChar"/>
-        </w:rPr>
-        <w:t xml:space="preserve"> no hay nombre ni fecha para el nombre / estructura antes de uso /</w:t>
-      </w:r>
-      <w:r>
-        <w:br/>
-      </w:r>
-      <w:r>
-        <w:rPr>
-          <w:rStyle w:val="VerbatimChar"/>
-        </w:rPr>
-        <w:t xml:space="preserve"> "más manuales primero" como condición / conflicto laboral sin</w:t>
-      </w:r>
-      <w:r>
-        <w:br/>
-      </w:r>
-      <w:r>
-        <w:rPr>
-          <w:rStyle w:val="VerbatimChar"/>
-        </w:rPr>
-        <w:t xml:space="preserve"> salida / pide costos sin dar datos.</w:t>
-      </w:r>
-    </w:p>
-    <w:p>
-      <w:r>
-        <w:pict>
-          <v:rect style="width:0;height:1.5pt" o:hralign="center" o:hrstd="t" o:hr="t"/>
-        </w:pict>
-      </w:r>
-    </w:p>
-    <w:bookmarkEnd w:id="48"/>
-    <w:bookmarkStart w:id="54" w:name="documentos-relacionados"/>
-    <w:p>
-      <w:pPr>
-        <w:pStyle w:val="Heading2"/>
-      </w:pPr>
-      <w:r>
-        <w:t xml:space="preserve">16. Documentos relacionados</w:t>
+        <w:t xml:space="preserve">14. Señales para pausar</w:t>
       </w:r>
     </w:p>
     <w:p>
@@ -6677,7 +6121,906 @@
           <w:numId w:val="1010"/>
         </w:numPr>
       </w:pPr>
-      <w:hyperlink r:id="rId49">
+      <w:r>
+        <w:t xml:space="preserve">No puede nombrar a nadie ni dar fecha para nombrarlo.</w:t>
+      </w:r>
+    </w:p>
+    <w:p>
+      <w:pPr>
+        <w:pStyle w:val="Compact"/>
+        <w:numPr>
+          <w:ilvl w:val="0"/>
+          <w:numId w:val="1010"/>
+        </w:numPr>
+      </w:pPr>
+      <w:r>
+        <w:t xml:space="preserve">Los usuarios nombrados no entran en la semana acordada y no responde a un recordatorio.</w:t>
+      </w:r>
+    </w:p>
+    <w:p>
+      <w:pPr>
+        <w:pStyle w:val="Compact"/>
+        <w:numPr>
+          <w:ilvl w:val="0"/>
+          <w:numId w:val="1010"/>
+        </w:numPr>
+      </w:pPr>
+      <w:r>
+        <w:t xml:space="preserve">Habla de estructura, porcentaje o exclusividad antes de que nadie haya usado la app.</w:t>
+      </w:r>
+    </w:p>
+    <w:p>
+      <w:pPr>
+        <w:pStyle w:val="Compact"/>
+        <w:numPr>
+          <w:ilvl w:val="0"/>
+          <w:numId w:val="1010"/>
+        </w:numPr>
+      </w:pPr>
+      <w:r>
+        <w:t xml:space="preserve">Pide más manuales cargados como condición previa a que alguien pruebe.</w:t>
+      </w:r>
+    </w:p>
+    <w:p>
+      <w:pPr>
+        <w:pStyle w:val="Compact"/>
+        <w:numPr>
+          <w:ilvl w:val="0"/>
+          <w:numId w:val="1010"/>
+        </w:numPr>
+      </w:pPr>
+      <w:r>
+        <w:t xml:space="preserve">Aparece un conflicto con su empleador que no puede resolver.</w:t>
+      </w:r>
+    </w:p>
+    <w:p>
+      <w:pPr>
+        <w:pStyle w:val="Compact"/>
+        <w:numPr>
+          <w:ilvl w:val="0"/>
+          <w:numId w:val="1010"/>
+        </w:numPr>
+      </w:pPr>
+      <w:r>
+        <w:t xml:space="preserve">Pide costos con insistencia sin aportar datos de mercado.</w:t>
+      </w:r>
+    </w:p>
+    <w:p>
+      <w:pPr>
+        <w:pStyle w:val="FirstParagraph"/>
+      </w:pPr>
+      <w:r>
+        <w:t xml:space="preserve">Con dos de estas: escenario C. Se resuelve por escrito la custodia del corpus y se sigue con Carlos, Venezuela y el registro MINVU. Sin drama y sin cerrar la puerta.</w:t>
+      </w:r>
+    </w:p>
+    <w:p>
+      <w:pPr>
+        <w:pStyle w:val="BodyText"/>
+      </w:pPr>
+      <w:r>
+        <w:rPr>
+          <w:b/>
+          <w:bCs/>
+        </w:rPr>
+        <w:t xml:space="preserve">Regla de cierre del Plan General, que no cambia por esta reunión:</w:t>
+      </w:r>
+      <w:r>
+        <w:t xml:space="preserve"> </w:t>
+      </w:r>
+      <w:r>
+        <w:t xml:space="preserve">ninguna decisión de producto, gasto, postulación, venta o fecha depende de Gonzalo. Los gates del 16 de septiembre, 2 de octubre y 2 de noviembre no se mueven por lo que pase el viernes.</w:t>
+      </w:r>
+    </w:p>
+    <w:p>
+      <w:r>
+        <w:pict>
+          <v:rect style="width:0;height:1.5pt" o:hralign="center" o:hrstd="t" o:hr="t"/>
+        </w:pict>
+      </w:r>
+    </w:p>
+    <w:bookmarkEnd w:id="48"/>
+    <w:bookmarkStart w:id="49" w:name="hoja-de-bolsillo"/>
+    <w:p>
+      <w:pPr>
+        <w:pStyle w:val="Heading2"/>
+      </w:pPr>
+      <w:r>
+        <w:t xml:space="preserve">15. Hoja de bolsillo</w:t>
+      </w:r>
+    </w:p>
+    <w:p>
+      <w:pPr>
+        <w:pStyle w:val="SourceCode"/>
+      </w:pPr>
+      <w:r>
+        <w:rPr>
+          <w:rStyle w:val="VerbatimChar"/>
+        </w:rPr>
+        <w:t xml:space="preserve">OBJETIVO ÚNICO: nombre + caso + fecha inicio + fecha revisión.</w:t>
+      </w:r>
+      <w:r>
+        <w:br/>
+      </w:r>
+      <w:r>
+        <w:rPr>
+          <w:rStyle w:val="VerbatimChar"/>
+        </w:rPr>
+        <w:t xml:space="preserve">Sin eso no cerró. Todo lo demás es información.</w:t>
+      </w:r>
+      <w:r>
+        <w:br/>
+      </w:r>
+      <w:r>
+        <w:br/>
+      </w:r>
+      <w:r>
+        <w:rPr>
+          <w:rStyle w:val="VerbatimChar"/>
+        </w:rPr>
+        <w:t xml:space="preserve">APERTURA (su idea, con atribución)</w:t>
+      </w:r>
+      <w:r>
+        <w:br/>
+      </w:r>
+      <w:r>
+        <w:rPr>
+          <w:rStyle w:val="VerbatimChar"/>
+        </w:rPr>
+        <w:t xml:space="preserve">"Me dijiste que lo valioso no era consultar el manual, sino que el</w:t>
+      </w:r>
+      <w:r>
+        <w:br/>
+      </w:r>
+      <w:r>
+        <w:rPr>
+          <w:rStyle w:val="VerbatimChar"/>
+        </w:rPr>
+        <w:t xml:space="preserve"> historial de fallas por marca quedara en la empresa y no en el</w:t>
+      </w:r>
+      <w:r>
+        <w:br/>
+      </w:r>
+      <w:r>
+        <w:rPr>
+          <w:rStyle w:val="VerbatimChar"/>
+        </w:rPr>
+        <w:t xml:space="preserve"> técnico, y que hubiera una base multimarca. Con tus manuales eso</w:t>
+      </w:r>
+      <w:r>
+        <w:br/>
+      </w:r>
+      <w:r>
+        <w:rPr>
+          <w:rStyle w:val="VerbatimChar"/>
+        </w:rPr>
+        <w:t xml:space="preserve"> es lo que hay hoy. Quiero mostrártelo y saber si sigues pensando</w:t>
+      </w:r>
+      <w:r>
+        <w:br/>
+      </w:r>
+      <w:r>
+        <w:rPr>
+          <w:rStyle w:val="VerbatimChar"/>
+        </w:rPr>
+        <w:t xml:space="preserve"> lo mismo."</w:t>
+      </w:r>
+      <w:r>
+        <w:br/>
+      </w:r>
+      <w:r>
+        <w:br/>
+      </w:r>
+      <w:r>
+        <w:rPr>
+          <w:rStyle w:val="VerbatimChar"/>
+        </w:rPr>
+        <w:t xml:space="preserve">DEMO 15 min, teléfono</w:t>
+      </w:r>
+      <w:r>
+        <w:br/>
+      </w:r>
+      <w:r>
+        <w:rPr>
+          <w:rStyle w:val="VerbatimChar"/>
+        </w:rPr>
+        <w:t xml:space="preserve"> Biblioteca (180 docs, 6 marcas) -&gt; él elige marca y pregunta x3</w:t>
+      </w:r>
+      <w:r>
+        <w:br/>
+      </w:r>
+      <w:r>
+        <w:rPr>
+          <w:rStyle w:val="VerbatimChar"/>
+        </w:rPr>
+        <w:t xml:space="preserve"> FOTO: consola/tarjeta, no plano (si insiste: frase de límite</w:t>
+      </w:r>
+      <w:r>
+        <w:br/>
+      </w:r>
+      <w:r>
+        <w:rPr>
+          <w:rStyle w:val="VerbatimChar"/>
+        </w:rPr>
+        <w:t xml:space="preserve">   antes; NO componente quemado)</w:t>
+      </w:r>
+      <w:r>
+        <w:br/>
+      </w:r>
+      <w:r>
+        <w:rPr>
+          <w:rStyle w:val="VerbatimChar"/>
+        </w:rPr>
+        <w:t xml:space="preserve"> -&gt; Schindler/Fermator: declara sin evidencia</w:t>
+      </w:r>
+      <w:r>
+        <w:br/>
+      </w:r>
+      <w:r>
+        <w:rPr>
+          <w:rStyle w:val="VerbatimChar"/>
+        </w:rPr>
+        <w:t xml:space="preserve"> -&gt; traza de sesión -&gt; cupo por usuario (NUNCA en pesos)</w:t>
+      </w:r>
+      <w:r>
+        <w:br/>
+      </w:r>
+      <w:r>
+        <w:rPr>
+          <w:rStyle w:val="VerbatimChar"/>
+        </w:rPr>
+        <w:t xml:space="preserve"> Decir yo primero: "esto no reemplaza el tester; el código puede</w:t>
+      </w:r>
+      <w:r>
+        <w:br/>
+      </w:r>
+      <w:r>
+        <w:rPr>
+          <w:rStyle w:val="VerbatimChar"/>
+        </w:rPr>
+        <w:t xml:space="preserve"> decir puertas y ser el variador."</w:t>
+      </w:r>
+      <w:r>
+        <w:br/>
+      </w:r>
+      <w:r>
+        <w:br/>
+      </w:r>
+      <w:r>
+        <w:rPr>
+          <w:rStyle w:val="VerbatimChar"/>
+        </w:rPr>
+        <w:t xml:space="preserve">OBJECIONES -&gt; RESPUESTA</w:t>
+      </w:r>
+      <w:r>
+        <w:br/>
+      </w:r>
+      <w:r>
+        <w:rPr>
+          <w:rStyle w:val="VerbatimChar"/>
+        </w:rPr>
+        <w:t xml:space="preserve"> "el código miente"         -&gt; cierto; el diagnóstico es del técnico</w:t>
+      </w:r>
+      <w:r>
+        <w:br/>
+      </w:r>
+      <w:r>
+        <w:rPr>
+          <w:rStyle w:val="VerbatimChar"/>
+        </w:rPr>
+        <w:t xml:space="preserve"> "es la mitad de la pega"   -&gt; la mitad que hoy hace ing. de campo</w:t>
+      </w:r>
+      <w:r>
+        <w:br/>
+      </w:r>
+      <w:r>
+        <w:rPr>
+          <w:rStyle w:val="VerbatimChar"/>
+        </w:rPr>
+        <w:t xml:space="preserve"> "el quemado ya es la falla"-&gt; no uso esa foto</w:t>
+      </w:r>
+      <w:r>
+        <w:br/>
+      </w:r>
+      <w:r>
+        <w:rPr>
+          <w:rStyle w:val="VerbatimChar"/>
+        </w:rPr>
+        <w:t xml:space="preserve"> "ya tengo control+F"       -&gt; la carpeta la tienes tú, no el técnico</w:t>
+      </w:r>
+      <w:r>
+        <w:br/>
+      </w:r>
+      <w:r>
+        <w:rPr>
+          <w:rStyle w:val="VerbatimChar"/>
+        </w:rPr>
+        <w:t xml:space="preserve">                               en el foso; y son 6 marcas a la vez</w:t>
+      </w:r>
+      <w:r>
+        <w:br/>
+      </w:r>
+      <w:r>
+        <w:rPr>
+          <w:rStyle w:val="VerbatimChar"/>
+        </w:rPr>
+        <w:t xml:space="preserve"> "falsa confianza"          -&gt; cita página y declara los vacíos</w:t>
+      </w:r>
+      <w:r>
+        <w:br/>
+      </w:r>
+      <w:r>
+        <w:br/>
+      </w:r>
+      <w:r>
+        <w:rPr>
+          <w:rStyle w:val="VerbatimChar"/>
+        </w:rPr>
+        <w:t xml:space="preserve">CHATGPT (6)</w:t>
+      </w:r>
+      <w:r>
+        <w:br/>
+      </w:r>
+      <w:r>
+        <w:rPr>
+          <w:rStyle w:val="VerbatimChar"/>
+        </w:rPr>
+        <w:t xml:space="preserve"> 1 multicuenta/aislamiento  2 si no está lo dice + cita página</w:t>
+      </w:r>
+      <w:r>
+        <w:br/>
+      </w:r>
+      <w:r>
+        <w:rPr>
+          <w:rStyle w:val="VerbatimChar"/>
+        </w:rPr>
+        <w:t xml:space="preserve"> 3 traza auditable por técnico  4 calibra con uso real</w:t>
+      </w:r>
+      <w:r>
+        <w:br/>
+      </w:r>
+      <w:r>
+        <w:rPr>
+          <w:rStyle w:val="VerbatimChar"/>
+        </w:rPr>
+        <w:t xml:space="preserve"> 5 contexto acotado  6 cupo visible (sin pesos)</w:t>
+      </w:r>
+      <w:r>
+        <w:br/>
+      </w:r>
+      <w:r>
+        <w:rPr>
+          <w:rStyle w:val="VerbatimChar"/>
+        </w:rPr>
+        <w:t xml:space="preserve"> Cierre: "pruébalo con una pregunta difícil, ahora"</w:t>
+      </w:r>
+      <w:r>
+        <w:br/>
+      </w:r>
+      <w:r>
+        <w:rPr>
+          <w:rStyle w:val="VerbatimChar"/>
+        </w:rPr>
+        <w:t xml:space="preserve"> Prohibido: "garantizo la precisión", "no alucina"</w:t>
+      </w:r>
+      <w:r>
+        <w:br/>
+      </w:r>
+      <w:r>
+        <w:br/>
+      </w:r>
+      <w:r>
+        <w:rPr>
+          <w:rStyle w:val="VerbatimChar"/>
+        </w:rPr>
+        <w:t xml:space="preserve">PREGUNTAS (1,2,4,5,8 obligatorias)</w:t>
+      </w:r>
+      <w:r>
+        <w:br/>
+      </w:r>
+      <w:r>
+        <w:rPr>
+          <w:rStyle w:val="VerbatimChar"/>
+        </w:rPr>
+        <w:t xml:space="preserve"> 1 ¿Qué esperabas ver hoy? ¿Qué te haría decir sirve / no sirve?</w:t>
+      </w:r>
+      <w:r>
+        <w:br/>
+      </w:r>
+      <w:r>
+        <w:rPr>
+          <w:rStyle w:val="VerbatimChar"/>
+        </w:rPr>
+        <w:t xml:space="preserve"> 2 Escalada a ingeniería de campo: ¿cuántas/semana, quién?</w:t>
+      </w:r>
+      <w:r>
+        <w:br/>
+      </w:r>
+      <w:r>
+        <w:rPr>
+          <w:rStyle w:val="VerbatimChar"/>
+        </w:rPr>
+        <w:t xml:space="preserve"> 3 Cartera que rechazan por marca desconocida: ¿cuánta, qué falta?</w:t>
+      </w:r>
+      <w:r>
+        <w:br/>
+      </w:r>
+      <w:r>
+        <w:rPr>
+          <w:rStyle w:val="VerbatimChar"/>
+        </w:rPr>
+        <w:t xml:space="preserve"> 4 ¿Cómo te imaginas participando? ¿tiempo real en 30 días?</w:t>
+      </w:r>
+      <w:r>
+        <w:br/>
+      </w:r>
+      <w:r>
+        <w:rPr>
+          <w:rStyle w:val="VerbatimChar"/>
+        </w:rPr>
+        <w:t xml:space="preserve"> 5 ¿Vender a otras mantenedoras te complica con tu empresa?</w:t>
+      </w:r>
+      <w:r>
+        <w:br/>
+      </w:r>
+      <w:r>
+        <w:rPr>
+          <w:rStyle w:val="VerbatimChar"/>
+        </w:rPr>
+        <w:t xml:space="preserve"> 6 ¿Quién decide software y hasta qué monto sin comité?</w:t>
+      </w:r>
+      <w:r>
+        <w:br/>
+      </w:r>
+      <w:r>
+        <w:rPr>
+          <w:rStyle w:val="VerbatimChar"/>
+        </w:rPr>
+        <w:t xml:space="preserve"> 7 ¿% mantención vs correctivos/modernizaciones?</w:t>
+      </w:r>
+      <w:r>
+        <w:br/>
+      </w:r>
+      <w:r>
+        <w:rPr>
+          <w:rStyle w:val="VerbatimChar"/>
+        </w:rPr>
+        <w:t xml:space="preserve"> 8 CIERRE: 1-2 ingenieros, 2 semanas: ¿quiénes, qué caso, cuándo?</w:t>
+      </w:r>
+      <w:r>
+        <w:br/>
+      </w:r>
+      <w:r>
+        <w:rPr>
+          <w:rStyle w:val="VerbatimChar"/>
+        </w:rPr>
+        <w:t xml:space="preserve"> (certificador) Cuando hacías los informes tú mismo, ¿cuánto se</w:t>
+      </w:r>
+      <w:r>
+        <w:br/>
+      </w:r>
+      <w:r>
+        <w:rPr>
+          <w:rStyle w:val="VerbatimChar"/>
+        </w:rPr>
+        <w:t xml:space="preserve">  te iba escribiéndolos después de la visita?</w:t>
+      </w:r>
+      <w:r>
+        <w:br/>
+      </w:r>
+      <w:r>
+        <w:br/>
+      </w:r>
+      <w:r>
+        <w:rPr>
+          <w:rStyle w:val="VerbatimChar"/>
+        </w:rPr>
+        <w:t xml:space="preserve">CORPUS (sin monto)</w:t>
+      </w:r>
+      <w:r>
+        <w:br/>
+      </w:r>
+      <w:r>
+        <w:rPr>
+          <w:rStyle w:val="VerbatimChar"/>
+        </w:rPr>
+        <w:t xml:space="preserve"> "Es lo más valioso que he recibido. Sin eso no tendría con qué</w:t>
+      </w:r>
+      <w:r>
+        <w:br/>
+      </w:r>
+      <w:r>
+        <w:rPr>
+          <w:rStyle w:val="VerbatimChar"/>
+        </w:rPr>
+        <w:t xml:space="preserve">  probar nada real. Están aislados y no los he usado con nadie.</w:t>
+      </w:r>
+      <w:r>
+        <w:br/>
+      </w:r>
+      <w:r>
+        <w:rPr>
+          <w:rStyle w:val="VerbatimChar"/>
+        </w:rPr>
+        <w:t xml:space="preserve">  ¿Se quedan solo ahí o pueden ser base para otros clientes?</w:t>
+      </w:r>
+      <w:r>
+        <w:br/>
+      </w:r>
+      <w:r>
+        <w:rPr>
+          <w:rStyle w:val="VerbatimChar"/>
+        </w:rPr>
+        <w:t xml:space="preserve">  Y si fuera lo segundo, ¿qué te gustaría a cambio?"</w:t>
+      </w:r>
+      <w:r>
+        <w:br/>
+      </w:r>
+      <w:r>
+        <w:rPr>
+          <w:rStyle w:val="VerbatimChar"/>
+        </w:rPr>
+        <w:t xml:space="preserve"> Si pregunta por qué no cargué todo: 6 marcas acordadas ~10 mil</w:t>
+      </w:r>
+      <w:r>
+        <w:br/>
+      </w:r>
+      <w:r>
+        <w:rPr>
+          <w:rStyle w:val="VerbatimChar"/>
+        </w:rPr>
+        <w:t xml:space="preserve"> págs; quedan ~15 mil. Cuesta por página y no quise pasarme de</w:t>
+      </w:r>
+      <w:r>
+        <w:br/>
+      </w:r>
+      <w:r>
+        <w:rPr>
+          <w:rStyle w:val="VerbatimChar"/>
+        </w:rPr>
+        <w:t xml:space="preserve"> lo acordado. Sin dólares, sin reclamo.</w:t>
+      </w:r>
+      <w:r>
+        <w:br/>
+      </w:r>
+      <w:r>
+        <w:br/>
+      </w:r>
+      <w:r>
+        <w:rPr>
+          <w:rStyle w:val="VerbatimChar"/>
+        </w:rPr>
+        <w:t xml:space="preserve">ACTIVACIÓN (sin número)</w:t>
+      </w:r>
+      <w:r>
+        <w:br/>
+      </w:r>
+      <w:r>
+        <w:rPr>
+          <w:rStyle w:val="VerbatimChar"/>
+        </w:rPr>
+        <w:t xml:space="preserve"> "No es solo cargar manuales: usuarios por técnico, biblioteca</w:t>
+      </w:r>
+      <w:r>
+        <w:br/>
+      </w:r>
+      <w:r>
+        <w:rPr>
+          <w:rStyle w:val="VerbatimChar"/>
+        </w:rPr>
+        <w:t xml:space="preserve">  aislada, y si quieres su propio dominio. Ya tengo un cliente</w:t>
+      </w:r>
+      <w:r>
+        <w:br/>
+      </w:r>
+      <w:r>
+        <w:rPr>
+          <w:rStyle w:val="VerbatimChar"/>
+        </w:rPr>
+        <w:t xml:space="preserve">  así. Se cobra aparte porque es trabajo por empresa."</w:t>
+      </w:r>
+      <w:r>
+        <w:br/>
+      </w:r>
+      <w:r>
+        <w:br/>
+      </w:r>
+      <w:r>
+        <w:rPr>
+          <w:rStyle w:val="VerbatimChar"/>
+        </w:rPr>
+        <w:t xml:space="preserve">SI PREGUNTA PRECIO / MODELO</w:t>
+      </w:r>
+      <w:r>
+        <w:br/>
+      </w:r>
+      <w:r>
+        <w:rPr>
+          <w:rStyle w:val="VerbatimChar"/>
+        </w:rPr>
+        <w:t xml:space="preserve"> 1 "Tres formas: por técnico, por equipo, por informe. ¿Cuál</w:t>
+      </w:r>
+      <w:r>
+        <w:br/>
+      </w:r>
+      <w:r>
+        <w:rPr>
+          <w:rStyle w:val="VerbatimChar"/>
+        </w:rPr>
+        <w:t xml:space="preserve">    acepta una mantenedora y en qué rango?"</w:t>
+      </w:r>
+      <w:r>
+        <w:br/>
+      </w:r>
+      <w:r>
+        <w:rPr>
+          <w:rStyle w:val="VerbatimChar"/>
+        </w:rPr>
+        <w:t xml:space="preserve"> 2 "No está decidido: estoy midiendo el costo, falta el de la voz."</w:t>
+      </w:r>
+      <w:r>
+        <w:br/>
+      </w:r>
+      <w:r>
+        <w:rPr>
+          <w:rStyle w:val="VerbatimChar"/>
+        </w:rPr>
+        <w:t xml:space="preserve"> 3 "Te lo digo en octubre, con el piloto encima."</w:t>
+      </w:r>
+      <w:r>
+        <w:br/>
+      </w:r>
+      <w:r>
+        <w:rPr>
+          <w:rStyle w:val="VerbatimChar"/>
+        </w:rPr>
+        <w:t xml:space="preserve"> Puente: "el modelo lo define el piloto. Armemos la prueba."</w:t>
+      </w:r>
+      <w:r>
+        <w:br/>
+      </w:r>
+      <w:r>
+        <w:br/>
+      </w:r>
+      <w:r>
+        <w:rPr>
+          <w:rStyle w:val="VerbatimChar"/>
+        </w:rPr>
+        <w:t xml:space="preserve">VISIÓN (solo min 42-45, después del cierre)</w:t>
+      </w:r>
+      <w:r>
+        <w:br/>
+      </w:r>
+      <w:r>
+        <w:rPr>
+          <w:rStyle w:val="VerbatimChar"/>
+        </w:rPr>
+        <w:t xml:space="preserve"> "Que el técnico deje el teléfono en el piso, pregunte hablando y</w:t>
+      </w:r>
+      <w:r>
+        <w:br/>
+      </w:r>
+      <w:r>
+        <w:rPr>
+          <w:rStyle w:val="VerbatimChar"/>
+        </w:rPr>
+        <w:t xml:space="preserve">  la aplicación le conteste hablando y lo vaya guiando. Con</w:t>
+      </w:r>
+      <w:r>
+        <w:br/>
+      </w:r>
+      <w:r>
+        <w:rPr>
+          <w:rStyle w:val="VerbatimChar"/>
+        </w:rPr>
+        <w:t xml:space="preserve">  guantes, poca luz, sin soltar la herramienta. Es hacia donde</w:t>
+      </w:r>
+      <w:r>
+        <w:br/>
+      </w:r>
+      <w:r>
+        <w:rPr>
+          <w:rStyle w:val="VerbatimChar"/>
+        </w:rPr>
+        <w:t xml:space="preserve">  va Danebo."</w:t>
+      </w:r>
+      <w:r>
+        <w:br/>
+      </w:r>
+      <w:r>
+        <w:rPr>
+          <w:rStyle w:val="VerbatimChar"/>
+        </w:rPr>
+        <w:t xml:space="preserve"> "Lo que me tiene indeciso es cuál de los tres módulos construyo</w:t>
+      </w:r>
+      <w:r>
+        <w:br/>
+      </w:r>
+      <w:r>
+        <w:rPr>
+          <w:rStyle w:val="VerbatimChar"/>
+        </w:rPr>
+        <w:t xml:space="preserve">  primero. El piloto me lo dice."</w:t>
+      </w:r>
+      <w:r>
+        <w:br/>
+      </w:r>
+      <w:r>
+        <w:rPr>
+          <w:rStyle w:val="VerbatimChar"/>
+        </w:rPr>
+        <w:t xml:space="preserve"> El piloto se hace con lo que existe hoy; la voz no es parte de él.</w:t>
+      </w:r>
+      <w:r>
+        <w:br/>
+      </w:r>
+      <w:r>
+        <w:rPr>
+          <w:rStyle w:val="VerbatimChar"/>
+        </w:rPr>
+        <w:t xml:space="preserve"> Voz del certificador: mostrarla solo si pasó 5 recorridos limpios.</w:t>
+      </w:r>
+      <w:r>
+        <w:br/>
+      </w:r>
+      <w:r>
+        <w:rPr>
+          <w:rStyle w:val="VerbatimChar"/>
+        </w:rPr>
+        <w:t xml:space="preserve"> Es rumbo, no oferta. NO prometer fechas ni alcance.</w:t>
+      </w:r>
+      <w:r>
+        <w:br/>
+      </w:r>
+      <w:r>
+        <w:br/>
+      </w:r>
+      <w:r>
+        <w:rPr>
+          <w:rStyle w:val="VerbatimChar"/>
+        </w:rPr>
+        <w:t xml:space="preserve">NO DECIR</w:t>
+      </w:r>
+      <w:r>
+        <w:br/>
+      </w:r>
+      <w:r>
+        <w:rPr>
+          <w:rStyle w:val="VerbatimChar"/>
+        </w:rPr>
+        <w:t xml:space="preserve"> Precio, COGS, US$255, runway, CORFO, expansión regional,</w:t>
+      </w:r>
+      <w:r>
+        <w:br/>
+      </w:r>
+      <w:r>
+        <w:rPr>
+          <w:rStyle w:val="VerbatimChar"/>
+        </w:rPr>
+        <w:t xml:space="preserve"> socio, equity, comisión, exclusividad, garantías absolutas.</w:t>
+      </w:r>
+      <w:r>
+        <w:br/>
+      </w:r>
+      <w:r>
+        <w:br/>
+      </w:r>
+      <w:r>
+        <w:rPr>
+          <w:rStyle w:val="VerbatimChar"/>
+        </w:rPr>
+        <w:t xml:space="preserve">CIERRE (en voz alta + escrito esa tarde)</w:t>
+      </w:r>
+      <w:r>
+        <w:br/>
+      </w:r>
+      <w:r>
+        <w:rPr>
+          <w:rStyle w:val="VerbatimChar"/>
+        </w:rPr>
+        <w:t xml:space="preserve"> Usuarios ______   Caso ______</w:t>
+      </w:r>
+      <w:r>
+        <w:br/>
+      </w:r>
+      <w:r>
+        <w:rPr>
+          <w:rStyle w:val="VerbatimChar"/>
+        </w:rPr>
+        <w:t xml:space="preserve"> Inicio ____  Revisión ____ (evitar 17-21 sep)</w:t>
+      </w:r>
+      <w:r>
+        <w:br/>
+      </w:r>
+      <w:r>
+        <w:rPr>
+          <w:rStyle w:val="VerbatimChar"/>
+        </w:rPr>
+        <w:t xml:space="preserve"> Yo: acceso e instrucciones el ____.  Él: que usen.</w:t>
+      </w:r>
+      <w:r>
+        <w:br/>
+      </w:r>
+      <w:r>
+        <w:rPr>
+          <w:rStyle w:val="VerbatimChar"/>
+        </w:rPr>
+        <w:t xml:space="preserve"> Éxito: 1 persona, 2 sesiones reales, sin mi ayuda, y me dice</w:t>
+      </w:r>
+      <w:r>
+        <w:br/>
+      </w:r>
+      <w:r>
+        <w:rPr>
+          <w:rStyle w:val="VerbatimChar"/>
+        </w:rPr>
+        <w:t xml:space="preserve"> una consulta que sirvió y una que falló.</w:t>
+      </w:r>
+      <w:r>
+        <w:br/>
+      </w:r>
+      <w:r>
+        <w:br/>
+      </w:r>
+      <w:r>
+        <w:rPr>
+          <w:rStyle w:val="VerbatimChar"/>
+        </w:rPr>
+        <w:t xml:space="preserve">PAUSA SI</w:t>
+      </w:r>
+      <w:r>
+        <w:br/>
+      </w:r>
+      <w:r>
+        <w:rPr>
+          <w:rStyle w:val="VerbatimChar"/>
+        </w:rPr>
+        <w:t xml:space="preserve"> no hay nombre ni fecha para el nombre / estructura antes de uso /</w:t>
+      </w:r>
+      <w:r>
+        <w:br/>
+      </w:r>
+      <w:r>
+        <w:rPr>
+          <w:rStyle w:val="VerbatimChar"/>
+        </w:rPr>
+        <w:t xml:space="preserve"> "más manuales primero" como condición / conflicto laboral sin</w:t>
+      </w:r>
+      <w:r>
+        <w:br/>
+      </w:r>
+      <w:r>
+        <w:rPr>
+          <w:rStyle w:val="VerbatimChar"/>
+        </w:rPr>
+        <w:t xml:space="preserve"> salida / pide costos sin dar datos.</w:t>
+      </w:r>
+    </w:p>
+    <w:p>
+      <w:r>
+        <w:pict>
+          <v:rect style="width:0;height:1.5pt" o:hralign="center" o:hrstd="t" o:hr="t"/>
+        </w:pict>
+      </w:r>
+    </w:p>
+    <w:bookmarkEnd w:id="49"/>
+    <w:bookmarkStart w:id="55" w:name="documentos-relacionados"/>
+    <w:p>
+      <w:pPr>
+        <w:pStyle w:val="Heading2"/>
+      </w:pPr>
+      <w:r>
+        <w:t xml:space="preserve">16. Documentos relacionados</w:t>
+      </w:r>
+    </w:p>
+    <w:p>
+      <w:pPr>
+        <w:pStyle w:val="Compact"/>
+        <w:numPr>
+          <w:ilvl w:val="0"/>
+          <w:numId w:val="1011"/>
+        </w:numPr>
+      </w:pPr>
+      <w:hyperlink r:id="rId50">
         <w:r>
           <w:rPr>
             <w:rStyle w:val="Hyperlink"/>
@@ -6697,10 +7040,10 @@
         <w:pStyle w:val="Compact"/>
         <w:numPr>
           <w:ilvl w:val="0"/>
-          <w:numId w:val="1010"/>
+          <w:numId w:val="1011"/>
         </w:numPr>
       </w:pPr>
-      <w:hyperlink r:id="rId50">
+      <w:hyperlink r:id="rId51">
         <w:r>
           <w:rPr>
             <w:rStyle w:val="Hyperlink"/>
@@ -6720,10 +7063,10 @@
         <w:pStyle w:val="Compact"/>
         <w:numPr>
           <w:ilvl w:val="0"/>
-          <w:numId w:val="1010"/>
+          <w:numId w:val="1011"/>
         </w:numPr>
       </w:pPr>
-      <w:hyperlink r:id="rId51">
+      <w:hyperlink r:id="rId52">
         <w:r>
           <w:rPr>
             <w:rStyle w:val="Hyperlink"/>
@@ -6743,10 +7086,10 @@
         <w:pStyle w:val="Compact"/>
         <w:numPr>
           <w:ilvl w:val="0"/>
-          <w:numId w:val="1010"/>
+          <w:numId w:val="1011"/>
         </w:numPr>
       </w:pPr>
-      <w:hyperlink r:id="rId52">
+      <w:hyperlink r:id="rId53">
         <w:r>
           <w:rPr>
             <w:rStyle w:val="Hyperlink"/>
@@ -6766,10 +7109,10 @@
         <w:pStyle w:val="Compact"/>
         <w:numPr>
           <w:ilvl w:val="0"/>
-          <w:numId w:val="1010"/>
+          <w:numId w:val="1011"/>
         </w:numPr>
       </w:pPr>
-      <w:hyperlink r:id="rId15">
+      <w:hyperlink r:id="rId16">
         <w:r>
           <w:rPr>
             <w:rStyle w:val="Hyperlink"/>
@@ -6789,10 +7132,10 @@
         <w:pStyle w:val="Compact"/>
         <w:numPr>
           <w:ilvl w:val="0"/>
-          <w:numId w:val="1010"/>
+          <w:numId w:val="1011"/>
         </w:numPr>
       </w:pPr>
-      <w:hyperlink r:id="rId53">
+      <w:hyperlink r:id="rId54">
         <w:r>
           <w:rPr>
             <w:rStyle w:val="Hyperlink"/>
@@ -6807,8 +7150,8 @@
         <w:t xml:space="preserve">— telemetría de la demo del 6 de agosto</w:t>
       </w:r>
     </w:p>
-    <w:bookmarkEnd w:id="54"/>
     <w:bookmarkEnd w:id="55"/>
+    <w:bookmarkEnd w:id="56"/>
     <w:sectPr>
       <w:footnotePr>
         <w:numRestart w:val="eachSect"/>
@@ -7144,34 +7487,7 @@
     <w:abstractNumId w:val="991"/>
   </w:num>
   <w:num w:numId="1003">
-    <w:abstractNumId w:val="99411"/>
-    <w:lvlOverride w:ilvl="0">
-      <w:startOverride w:val="1"/>
-    </w:lvlOverride>
-    <w:lvlOverride w:ilvl="1">
-      <w:startOverride w:val="1"/>
-    </w:lvlOverride>
-    <w:lvlOverride w:ilvl="2">
-      <w:startOverride w:val="1"/>
-    </w:lvlOverride>
-    <w:lvlOverride w:ilvl="3">
-      <w:startOverride w:val="1"/>
-    </w:lvlOverride>
-    <w:lvlOverride w:ilvl="4">
-      <w:startOverride w:val="1"/>
-    </w:lvlOverride>
-    <w:lvlOverride w:ilvl="5">
-      <w:startOverride w:val="1"/>
-    </w:lvlOverride>
-    <w:lvlOverride w:ilvl="6">
-      <w:startOverride w:val="1"/>
-    </w:lvlOverride>
-    <w:lvlOverride w:ilvl="7">
-      <w:startOverride w:val="1"/>
-    </w:lvlOverride>
-    <w:lvlOverride w:ilvl="8">
-      <w:startOverride w:val="1"/>
-    </w:lvlOverride>
+    <w:abstractNumId w:val="991"/>
   </w:num>
   <w:num w:numId="1004">
     <w:abstractNumId w:val="99411"/>
@@ -7264,9 +7580,6 @@
     </w:lvlOverride>
   </w:num>
   <w:num w:numId="1007">
-    <w:abstractNumId w:val="991"/>
-  </w:num>
-  <w:num w:numId="1008">
     <w:abstractNumId w:val="99411"/>
     <w:lvlOverride w:ilvl="0">
       <w:startOverride w:val="1"/>
@@ -7296,10 +7609,43 @@
       <w:startOverride w:val="1"/>
     </w:lvlOverride>
   </w:num>
-  <w:num w:numId="1009">
+  <w:num w:numId="1008">
     <w:abstractNumId w:val="991"/>
   </w:num>
+  <w:num w:numId="1009">
+    <w:abstractNumId w:val="99411"/>
+    <w:lvlOverride w:ilvl="0">
+      <w:startOverride w:val="1"/>
+    </w:lvlOverride>
+    <w:lvlOverride w:ilvl="1">
+      <w:startOverride w:val="1"/>
+    </w:lvlOverride>
+    <w:lvlOverride w:ilvl="2">
+      <w:startOverride w:val="1"/>
+    </w:lvlOverride>
+    <w:lvlOverride w:ilvl="3">
+      <w:startOverride w:val="1"/>
+    </w:lvlOverride>
+    <w:lvlOverride w:ilvl="4">
+      <w:startOverride w:val="1"/>
+    </w:lvlOverride>
+    <w:lvlOverride w:ilvl="5">
+      <w:startOverride w:val="1"/>
+    </w:lvlOverride>
+    <w:lvlOverride w:ilvl="6">
+      <w:startOverride w:val="1"/>
+    </w:lvlOverride>
+    <w:lvlOverride w:ilvl="7">
+      <w:startOverride w:val="1"/>
+    </w:lvlOverride>
+    <w:lvlOverride w:ilvl="8">
+      <w:startOverride w:val="1"/>
+    </w:lvlOverride>
+  </w:num>
   <w:num w:numId="1010">
+    <w:abstractNumId w:val="991"/>
+  </w:num>
+  <w:num w:numId="1011">
     <w:abstractNumId w:val="991"/>
   </w:num>
 </w:numbering>
@@ -7313,7 +7659,7 @@
         <w:rFonts w:asciiTheme="minorHAnsi" w:cstheme="minorBidi" w:eastAsiaTheme="minorEastAsia" w:hAnsiTheme="minorHAnsi"/>
         <w:sz w:val="24"/>
         <w:szCs w:val="24"/>
-        <w:lang w:bidi="ar-SA" w:eastAsia="zh-CN" w:val="en-US"/>
+        <w:lang w:bidi="ar-SA" w:eastAsia="zh-CN" w:val="es"/>
       </w:rPr>
     </w:rPrDefault>
     <w:pPrDefault>

</xml_diff>